<commit_message>
transfer data to new folder?
</commit_message>
<xml_diff>
--- a/E-Bike Data Logger Documentation.docx
+++ b/E-Bike Data Logger Documentation.docx
@@ -15,15 +15,7 @@
         <w:jc w:val="center"/>
       </w:pPr>
       <w:r>
-        <w:t xml:space="preserve">For </w:t>
-      </w:r>
-      <w:proofErr w:type="spellStart"/>
-      <w:r>
-        <w:t>Thalchemy</w:t>
-      </w:r>
-      <w:proofErr w:type="spellEnd"/>
-      <w:r>
-        <w:t xml:space="preserve"> and the Bureau of Land Management</w:t>
+        <w:t>For Thalchemy and the Bureau of Land Management</w:t>
       </w:r>
     </w:p>
     <w:p>
@@ -49,10 +41,43 @@
     </w:p>
     <w:p>
       <w:pPr>
+        <w:pStyle w:val="ListParagraph"/>
+        <w:numPr>
+          <w:ilvl w:val="1"/>
+          <w:numId w:val="6"/>
+        </w:numPr>
+      </w:pPr>
+      <w:r>
+        <w:t xml:space="preserve"> </w:t>
+      </w:r>
+      <w:r>
+        <w:t>Deployment</w:t>
+      </w:r>
+    </w:p>
+    <w:p>
+      <w:pPr>
+        <w:pStyle w:val="ListParagraph"/>
+        <w:numPr>
+          <w:ilvl w:val="1"/>
+          <w:numId w:val="6"/>
+        </w:numPr>
+      </w:pPr>
+      <w:r>
+        <w:t xml:space="preserve"> UI installation and usage</w:t>
+      </w:r>
+    </w:p>
+    <w:p>
+      <w:pPr>
         <w:ind w:firstLine="720"/>
       </w:pPr>
       <w:r>
-        <w:t>1.1. Deployment</w:t>
+        <w:t>1.</w:t>
+      </w:r>
+      <w:r>
+        <w:t>3</w:t>
+      </w:r>
+      <w:r>
+        <w:t>. Data Collection</w:t>
       </w:r>
     </w:p>
     <w:p>
@@ -60,7 +85,13 @@
         <w:ind w:firstLine="720"/>
       </w:pPr>
       <w:r>
-        <w:t>1.2. Data Collection</w:t>
+        <w:t>1.</w:t>
+      </w:r>
+      <w:r>
+        <w:t>4</w:t>
+      </w:r>
+      <w:r>
+        <w:t>. Changing Batteries</w:t>
       </w:r>
     </w:p>
     <w:p>
@@ -68,15 +99,13 @@
         <w:ind w:firstLine="720"/>
       </w:pPr>
       <w:r>
-        <w:t>1.3. Changing Batteries</w:t>
-      </w:r>
-    </w:p>
-    <w:p>
-      <w:pPr>
-        <w:ind w:firstLine="720"/>
-      </w:pPr>
-      <w:r>
-        <w:t>1.4. Troubleshooting</w:t>
+        <w:t>1.</w:t>
+      </w:r>
+      <w:r>
+        <w:t>5</w:t>
+      </w:r>
+      <w:r>
+        <w:t>. Troubleshooting</w:t>
       </w:r>
     </w:p>
     <w:p>
@@ -87,7 +116,19 @@
     <w:p>
       <w:r>
         <w:tab/>
-        <w:t>2.1. Schematics</w:t>
+        <w:t>2.1. Materials and sources</w:t>
+      </w:r>
+    </w:p>
+    <w:p>
+      <w:r>
+        <w:tab/>
+        <w:t>2.</w:t>
+      </w:r>
+      <w:r>
+        <w:t>2</w:t>
+      </w:r>
+      <w:r>
+        <w:t>. Schematics</w:t>
       </w:r>
     </w:p>
     <w:p>
@@ -126,7 +167,21 @@
           <w:sz w:val="26"/>
           <w:szCs w:val="26"/>
         </w:rPr>
-        <w:t xml:space="preserve">Section1: Deployment and Maintenance </w:t>
+        <w:t>Section</w:t>
+      </w:r>
+      <w:r>
+        <w:rPr>
+          <w:sz w:val="26"/>
+          <w:szCs w:val="26"/>
+        </w:rPr>
+        <w:t xml:space="preserve"> </w:t>
+      </w:r>
+      <w:r>
+        <w:rPr>
+          <w:sz w:val="26"/>
+          <w:szCs w:val="26"/>
+        </w:rPr>
+        <w:t xml:space="preserve">1: Deployment and Maintenance </w:t>
       </w:r>
       <w:r>
         <w:rPr>
@@ -161,14 +216,19 @@
     <w:p>
       <w:r>
         <w:tab/>
-      </w:r>
-      <w:proofErr w:type="gramStart"/>
-      <w:r>
-        <w:t>In order to</w:t>
-      </w:r>
-      <w:proofErr w:type="gramEnd"/>
-      <w:r>
-        <w:t xml:space="preserve"> deploy a sensor array and be able to collect the most high-fidelity data, the following instructions must be followed. </w:t>
+        <w:t xml:space="preserve">In order to deploy a sensor array and be able to collect the most high-fidelity data, the following instructions must be followed. </w:t>
+      </w:r>
+    </w:p>
+    <w:p>
+      <w:pPr>
+        <w:pStyle w:val="ListParagraph"/>
+        <w:numPr>
+          <w:ilvl w:val="0"/>
+          <w:numId w:val="3"/>
+        </w:numPr>
+      </w:pPr>
+      <w:r>
+        <w:t>Ensure the battery is fully charged</w:t>
       </w:r>
     </w:p>
     <w:p>
@@ -179,7 +239,13 @@
         </w:numPr>
       </w:pPr>
       <w:r>
-        <w:t>Burial location must be flat with no significant hills immediately before or after it from either direction of travel. This must be a path that does not allow cars, ATVS or other motorized vehicles.</w:t>
+        <w:t>Burial location must be flat with no significant hills immediately before or after it from either direction of travel. This must be a</w:t>
+      </w:r>
+      <w:r>
+        <w:t xml:space="preserve"> non-motorized </w:t>
+      </w:r>
+      <w:r>
+        <w:t>path that does not allow cars, ATVS or other motorized vehicles.</w:t>
       </w:r>
     </w:p>
     <w:p>
@@ -189,13 +255,20 @@
           <w:numId w:val="1"/>
         </w:numPr>
       </w:pPr>
-      <w:proofErr w:type="gramStart"/>
-      <w:r>
-        <w:t>A through</w:t>
-      </w:r>
-      <w:proofErr w:type="gramEnd"/>
-      <w:r>
-        <w:t xml:space="preserve"> 3 inches deep, 2 inches wide and 24 inches across must be dug perpendicular to direction of travel on a trail</w:t>
+      <w:r>
+        <w:t xml:space="preserve">A through </w:t>
+      </w:r>
+      <w:r>
+        <w:t>1.5</w:t>
+      </w:r>
+      <w:r>
+        <w:t xml:space="preserve"> inches deep, 2 inches wide and 2</w:t>
+      </w:r>
+      <w:r>
+        <w:t>8</w:t>
+      </w:r>
+      <w:r>
+        <w:t xml:space="preserve"> inches across must be dug perpendicular to direction of travel on a trail</w:t>
       </w:r>
     </w:p>
     <w:p>
@@ -206,7 +279,10 @@
         </w:numPr>
       </w:pPr>
       <w:r>
-        <w:t xml:space="preserve">The sensor array must be placed at the bottom of this hole and completely covered with dirt. </w:t>
+        <w:t xml:space="preserve">The sensor array must be placed </w:t>
+      </w:r>
+      <w:r>
+        <w:t>in the hole with dirt packed around it, leaving about a third of the pipe exposed.</w:t>
       </w:r>
     </w:p>
     <w:p>
@@ -217,15 +293,7 @@
         </w:numPr>
       </w:pPr>
       <w:r>
-        <w:t xml:space="preserve">The battery box must be just </w:t>
-      </w:r>
-      <w:proofErr w:type="gramStart"/>
-      <w:r>
-        <w:t>off of</w:t>
-      </w:r>
-      <w:proofErr w:type="gramEnd"/>
-      <w:r>
-        <w:t xml:space="preserve"> the trail, obscured from view by a bush, rocks or other natural items that blend in with the landscape</w:t>
+        <w:t>The battery box must be just off of the trail, obscured from view by a bush, rocks or other natural items that blend in with the landscape</w:t>
       </w:r>
     </w:p>
     <w:p>
@@ -236,20 +304,1230 @@
         </w:numPr>
       </w:pPr>
       <w:r>
-        <w:t xml:space="preserve">Ensure that the battery is plugged </w:t>
-      </w:r>
-      <w:proofErr w:type="gramStart"/>
-      <w:r>
-        <w:t>in</w:t>
-      </w:r>
-      <w:proofErr w:type="gramEnd"/>
-      <w:r>
-        <w:t xml:space="preserve"> and that the data connection cable is visible</w:t>
+        <w:t>Ensure that the battery is plugged in and that the data connection cable is visible</w:t>
       </w:r>
       <w:r>
         <w:t xml:space="preserve"> within the box.</w:t>
       </w:r>
     </w:p>
+    <w:p>
+      <w:pPr>
+        <w:jc w:val="right"/>
+        <w:rPr>
+          <w:sz w:val="26"/>
+          <w:szCs w:val="26"/>
+        </w:rPr>
+      </w:pPr>
+      <w:r>
+        <w:rPr>
+          <w:sz w:val="26"/>
+          <w:szCs w:val="26"/>
+        </w:rPr>
+        <w:t>1.</w:t>
+      </w:r>
+      <w:r>
+        <w:rPr>
+          <w:sz w:val="26"/>
+          <w:szCs w:val="26"/>
+        </w:rPr>
+        <w:t>2</w:t>
+      </w:r>
+      <w:r>
+        <w:rPr>
+          <w:sz w:val="26"/>
+          <w:szCs w:val="26"/>
+        </w:rPr>
+        <w:t xml:space="preserve"> </w:t>
+      </w:r>
+      <w:r>
+        <w:rPr>
+          <w:sz w:val="26"/>
+          <w:szCs w:val="26"/>
+        </w:rPr>
+        <w:t>UI Installation and Usage</w:t>
+      </w:r>
+    </w:p>
+    <w:p>
+      <w:r>
+        <w:t>The User Interface (UI) is the application that will be used to access and collect data collected by the microcontroller. This application is only runnable on windows machines, but should not require any other dependencies or installations.</w:t>
+      </w:r>
+    </w:p>
+    <w:p>
+      <w:r>
+        <w:t>INSTALLATION:</w:t>
+      </w:r>
+    </w:p>
+    <w:p>
+      <w:pPr>
+        <w:pStyle w:val="ListParagraph"/>
+        <w:numPr>
+          <w:ilvl w:val="0"/>
+          <w:numId w:val="3"/>
+        </w:numPr>
+      </w:pPr>
+      <w:r>
+        <w:t xml:space="preserve">Navigate to </w:t>
+      </w:r>
+      <w:hyperlink r:id="rId5" w:history="1">
+        <w:r>
+          <w:rPr>
+            <w:rStyle w:val="Hyperlink"/>
+          </w:rPr>
+          <w:t>zanderalbaz/EBike-Data-Logger</w:t>
+        </w:r>
+      </w:hyperlink>
+    </w:p>
+    <w:p>
+      <w:pPr>
+        <w:pStyle w:val="ListParagraph"/>
+        <w:numPr>
+          <w:ilvl w:val="0"/>
+          <w:numId w:val="3"/>
+        </w:numPr>
+      </w:pPr>
+      <w:r>
+        <w:t>Download “E-Bike_Data_Logger.zip”</w:t>
+      </w:r>
+    </w:p>
+    <w:p>
+      <w:pPr>
+        <w:pStyle w:val="ListParagraph"/>
+        <w:numPr>
+          <w:ilvl w:val="0"/>
+          <w:numId w:val="3"/>
+        </w:numPr>
+      </w:pPr>
+      <w:r>
+        <w:t>Extract the file</w:t>
+      </w:r>
+    </w:p>
+    <w:p>
+      <w:pPr>
+        <w:pStyle w:val="ListParagraph"/>
+        <w:numPr>
+          <w:ilvl w:val="0"/>
+          <w:numId w:val="3"/>
+        </w:numPr>
+      </w:pPr>
+      <w:r>
+        <w:t>Create a shortcut for the application and store it on your desktop</w:t>
+      </w:r>
+    </w:p>
+    <w:p>
+      <w:pPr>
+        <w:pStyle w:val="ListParagraph"/>
+        <w:numPr>
+          <w:ilvl w:val="1"/>
+          <w:numId w:val="3"/>
+        </w:numPr>
+      </w:pPr>
+      <w:r>
+        <w:t>Right click</w:t>
+      </w:r>
+    </w:p>
+    <w:p>
+      <w:pPr>
+        <w:pStyle w:val="ListParagraph"/>
+        <w:numPr>
+          <w:ilvl w:val="1"/>
+          <w:numId w:val="3"/>
+        </w:numPr>
+      </w:pPr>
+      <w:r>
+        <w:t>Show More Options</w:t>
+      </w:r>
+    </w:p>
+    <w:p>
+      <w:pPr>
+        <w:pStyle w:val="ListParagraph"/>
+        <w:numPr>
+          <w:ilvl w:val="1"/>
+          <w:numId w:val="3"/>
+        </w:numPr>
+      </w:pPr>
+      <w:r>
+        <w:lastRenderedPageBreak/>
+        <w:t>Create shortcut</w:t>
+      </w:r>
+    </w:p>
+    <w:p>
+      <w:pPr>
+        <w:pStyle w:val="ListParagraph"/>
+        <w:numPr>
+          <w:ilvl w:val="1"/>
+          <w:numId w:val="3"/>
+        </w:numPr>
+      </w:pPr>
+      <w:r>
+        <w:t>Drag and drop the shortcut to your desktop</w:t>
+      </w:r>
+    </w:p>
+    <w:p>
+      <w:r>
+        <w:t>USAGE:</w:t>
+      </w:r>
+    </w:p>
+    <w:p>
+      <w:pPr>
+        <w:pStyle w:val="ListParagraph"/>
+        <w:numPr>
+          <w:ilvl w:val="0"/>
+          <w:numId w:val="7"/>
+        </w:numPr>
+      </w:pPr>
+      <w:r>
+        <w:t>For Collection: The data cable must be connected to your machine</w:t>
+      </w:r>
+    </w:p>
+    <w:p>
+      <w:pPr>
+        <w:pStyle w:val="ListParagraph"/>
+        <w:numPr>
+          <w:ilvl w:val="0"/>
+          <w:numId w:val="7"/>
+        </w:numPr>
+      </w:pPr>
+      <w:r>
+        <w:t>For Data Viewing: The data table does not have to be connected to view historically collected data</w:t>
+      </w:r>
+    </w:p>
+    <w:p>
+      <w:pPr>
+        <w:rPr>
+          <w:sz w:val="26"/>
+          <w:szCs w:val="26"/>
+        </w:rPr>
+      </w:pPr>
+      <w:r>
+        <w:rPr>
+          <w:sz w:val="26"/>
+          <w:szCs w:val="26"/>
+        </w:rPr>
+        <w:tab/>
+      </w:r>
+      <w:r>
+        <w:rPr>
+          <w:sz w:val="26"/>
+          <w:szCs w:val="26"/>
+        </w:rPr>
+        <w:tab/>
+      </w:r>
+      <w:r>
+        <w:rPr>
+          <w:sz w:val="26"/>
+          <w:szCs w:val="26"/>
+        </w:rPr>
+        <w:tab/>
+      </w:r>
+      <w:r>
+        <w:rPr>
+          <w:sz w:val="26"/>
+          <w:szCs w:val="26"/>
+        </w:rPr>
+        <w:tab/>
+      </w:r>
+      <w:r>
+        <w:rPr>
+          <w:sz w:val="26"/>
+          <w:szCs w:val="26"/>
+        </w:rPr>
+        <w:tab/>
+      </w:r>
+      <w:r>
+        <w:rPr>
+          <w:sz w:val="26"/>
+          <w:szCs w:val="26"/>
+        </w:rPr>
+        <w:tab/>
+      </w:r>
+      <w:r>
+        <w:rPr>
+          <w:sz w:val="26"/>
+          <w:szCs w:val="26"/>
+        </w:rPr>
+        <w:tab/>
+      </w:r>
+      <w:r>
+        <w:rPr>
+          <w:sz w:val="26"/>
+          <w:szCs w:val="26"/>
+        </w:rPr>
+        <w:tab/>
+      </w:r>
+      <w:r>
+        <w:rPr>
+          <w:sz w:val="26"/>
+          <w:szCs w:val="26"/>
+        </w:rPr>
+        <w:tab/>
+        <w:t xml:space="preserve">         </w:t>
+      </w:r>
+      <w:r>
+        <w:rPr>
+          <w:sz w:val="26"/>
+          <w:szCs w:val="26"/>
+        </w:rPr>
+        <w:t>1.</w:t>
+      </w:r>
+      <w:r>
+        <w:rPr>
+          <w:sz w:val="26"/>
+          <w:szCs w:val="26"/>
+        </w:rPr>
+        <w:t>3</w:t>
+      </w:r>
+      <w:r>
+        <w:rPr>
+          <w:sz w:val="26"/>
+          <w:szCs w:val="26"/>
+        </w:rPr>
+        <w:t xml:space="preserve"> D</w:t>
+      </w:r>
+      <w:r>
+        <w:rPr>
+          <w:sz w:val="26"/>
+          <w:szCs w:val="26"/>
+        </w:rPr>
+        <w:t>ata Collection</w:t>
+      </w:r>
+    </w:p>
+    <w:p>
+      <w:r>
+        <w:t>Collection of bike signatures will happen automatically, but in order to have access to this data, the following step</w:t>
+      </w:r>
+      <w:r>
+        <w:t>s</w:t>
+      </w:r>
+      <w:r>
+        <w:t xml:space="preserve"> must be taken.</w:t>
+      </w:r>
+      <w:r>
+        <w:t xml:space="preserve"> If deployed correctly, this process should be straightforward and involve NO digging. It is NOT recommended to do this in wet conditions.</w:t>
+      </w:r>
+    </w:p>
+    <w:p>
+      <w:pPr>
+        <w:pStyle w:val="ListParagraph"/>
+        <w:numPr>
+          <w:ilvl w:val="0"/>
+          <w:numId w:val="2"/>
+        </w:numPr>
+      </w:pPr>
+      <w:r>
+        <w:t>Open the box containing the battery, data cable, and microcontroller</w:t>
+      </w:r>
+    </w:p>
+    <w:p>
+      <w:pPr>
+        <w:pStyle w:val="ListParagraph"/>
+        <w:numPr>
+          <w:ilvl w:val="0"/>
+          <w:numId w:val="2"/>
+        </w:numPr>
+      </w:pPr>
+      <w:r>
+        <w:t>Disconnect the data cable from the battery</w:t>
+      </w:r>
+    </w:p>
+    <w:p>
+      <w:pPr>
+        <w:pStyle w:val="ListParagraph"/>
+        <w:numPr>
+          <w:ilvl w:val="0"/>
+          <w:numId w:val="2"/>
+        </w:numPr>
+      </w:pPr>
+      <w:r>
+        <w:t xml:space="preserve">Plug this cable into your laptop (should already have the app installed see section </w:t>
+      </w:r>
+      <w:r>
+        <w:t>1.2</w:t>
+      </w:r>
+      <w:r>
+        <w:t xml:space="preserve"> for reference)</w:t>
+      </w:r>
+    </w:p>
+    <w:p>
+      <w:pPr>
+        <w:pStyle w:val="ListParagraph"/>
+        <w:numPr>
+          <w:ilvl w:val="0"/>
+          <w:numId w:val="2"/>
+        </w:numPr>
+      </w:pPr>
+      <w:r>
+        <w:t>Open the E-Bike Data Logger Application on your machine</w:t>
+      </w:r>
+    </w:p>
+    <w:p>
+      <w:pPr>
+        <w:pStyle w:val="ListParagraph"/>
+        <w:numPr>
+          <w:ilvl w:val="0"/>
+          <w:numId w:val="2"/>
+        </w:numPr>
+      </w:pPr>
+      <w:r>
+        <w:t>Click “Collect Data”</w:t>
+      </w:r>
+    </w:p>
+    <w:p>
+      <w:pPr>
+        <w:pStyle w:val="ListParagraph"/>
+        <w:numPr>
+          <w:ilvl w:val="0"/>
+          <w:numId w:val="2"/>
+        </w:numPr>
+      </w:pPr>
+      <w:r>
+        <w:t>Type in the location of the sensor array (whatever name/descriptor you have for it)</w:t>
+      </w:r>
+    </w:p>
+    <w:p>
+      <w:pPr>
+        <w:pStyle w:val="ListParagraph"/>
+        <w:numPr>
+          <w:ilvl w:val="0"/>
+          <w:numId w:val="2"/>
+        </w:numPr>
+      </w:pPr>
+      <w:r>
+        <w:t>Press the “EN” button on the microcontroller</w:t>
+      </w:r>
+    </w:p>
+    <w:p>
+      <w:pPr>
+        <w:pStyle w:val="ListParagraph"/>
+        <w:numPr>
+          <w:ilvl w:val="0"/>
+          <w:numId w:val="2"/>
+        </w:numPr>
+      </w:pPr>
+      <w:r>
+        <w:t>Immediately after, click “Confirm Data Transfer” in the application</w:t>
+      </w:r>
+    </w:p>
+    <w:p>
+      <w:pPr>
+        <w:pStyle w:val="ListParagraph"/>
+        <w:numPr>
+          <w:ilvl w:val="0"/>
+          <w:numId w:val="2"/>
+        </w:numPr>
+      </w:pPr>
+      <w:r>
+        <w:t>Wait for the transfer confirmation window to appear (this will take a few seconds, your data is downloading</w:t>
+      </w:r>
+    </w:p>
+    <w:p>
+      <w:pPr>
+        <w:pStyle w:val="ListParagraph"/>
+        <w:numPr>
+          <w:ilvl w:val="0"/>
+          <w:numId w:val="2"/>
+        </w:numPr>
+      </w:pPr>
+      <w:r>
+        <w:t>Disconnect from your laptop and plug the data cable back into the battery</w:t>
+      </w:r>
+    </w:p>
+    <w:p>
+      <w:pPr>
+        <w:pStyle w:val="ListParagraph"/>
+        <w:numPr>
+          <w:ilvl w:val="0"/>
+          <w:numId w:val="2"/>
+        </w:numPr>
+      </w:pPr>
+      <w:r>
+        <w:t>Shut the battery box and make sure it is hidden.</w:t>
+      </w:r>
+    </w:p>
+    <w:p>
+      <w:pPr>
+        <w:jc w:val="right"/>
+        <w:rPr>
+          <w:sz w:val="26"/>
+          <w:szCs w:val="26"/>
+        </w:rPr>
+      </w:pPr>
+      <w:r>
+        <w:rPr>
+          <w:sz w:val="26"/>
+          <w:szCs w:val="26"/>
+        </w:rPr>
+        <w:t>1.</w:t>
+      </w:r>
+      <w:r>
+        <w:rPr>
+          <w:sz w:val="26"/>
+          <w:szCs w:val="26"/>
+        </w:rPr>
+        <w:t>4</w:t>
+      </w:r>
+      <w:r>
+        <w:rPr>
+          <w:sz w:val="26"/>
+          <w:szCs w:val="26"/>
+        </w:rPr>
+        <w:t xml:space="preserve"> Changing Batteries</w:t>
+      </w:r>
+    </w:p>
+    <w:p>
+      <w:r>
+        <w:t xml:space="preserve">The battery within a sensor array should last for a month without intervention. To maintain functionality, the battery must be replaced every thirty days. There are two batteries that are compatible with the sensor array. </w:t>
+      </w:r>
+    </w:p>
+    <w:p>
+      <w:pPr>
+        <w:pStyle w:val="ListParagraph"/>
+        <w:numPr>
+          <w:ilvl w:val="0"/>
+          <w:numId w:val="4"/>
+        </w:numPr>
+      </w:pPr>
+      <w:r>
+        <w:t>Ensure that the replacement battery is fully charged</w:t>
+      </w:r>
+    </w:p>
+    <w:p>
+      <w:pPr>
+        <w:pStyle w:val="ListParagraph"/>
+        <w:numPr>
+          <w:ilvl w:val="0"/>
+          <w:numId w:val="4"/>
+        </w:numPr>
+      </w:pPr>
+      <w:r>
+        <w:t>Open the battery box</w:t>
+      </w:r>
+    </w:p>
+    <w:p>
+      <w:pPr>
+        <w:pStyle w:val="ListParagraph"/>
+        <w:numPr>
+          <w:ilvl w:val="0"/>
+          <w:numId w:val="4"/>
+        </w:numPr>
+      </w:pPr>
+      <w:r>
+        <w:t xml:space="preserve">Unplug the data cable from the current battery and carefully remove the battery without disrupting any pins </w:t>
+      </w:r>
+    </w:p>
+    <w:p>
+      <w:pPr>
+        <w:pStyle w:val="ListParagraph"/>
+        <w:numPr>
+          <w:ilvl w:val="0"/>
+          <w:numId w:val="4"/>
+        </w:numPr>
+      </w:pPr>
+      <w:r>
+        <w:t>Plug the data cable into the new battery</w:t>
+      </w:r>
+    </w:p>
+    <w:p>
+      <w:pPr>
+        <w:pStyle w:val="ListParagraph"/>
+        <w:numPr>
+          <w:ilvl w:val="0"/>
+          <w:numId w:val="4"/>
+        </w:numPr>
+      </w:pPr>
+      <w:r>
+        <w:t>Put the battery back into the box under the microcontroller</w:t>
+      </w:r>
+    </w:p>
+    <w:p>
+      <w:pPr>
+        <w:pStyle w:val="ListParagraph"/>
+        <w:numPr>
+          <w:ilvl w:val="0"/>
+          <w:numId w:val="4"/>
+        </w:numPr>
+      </w:pPr>
+      <w:r>
+        <w:t>Close the box and make sure it is hidden</w:t>
+      </w:r>
+    </w:p>
+    <w:p>
+      <w:pPr>
+        <w:pStyle w:val="ListParagraph"/>
+        <w:jc w:val="right"/>
+        <w:rPr>
+          <w:sz w:val="26"/>
+          <w:szCs w:val="26"/>
+        </w:rPr>
+      </w:pPr>
+      <w:r>
+        <w:rPr>
+          <w:sz w:val="26"/>
+          <w:szCs w:val="26"/>
+        </w:rPr>
+        <w:t>1.</w:t>
+      </w:r>
+      <w:r>
+        <w:rPr>
+          <w:sz w:val="26"/>
+          <w:szCs w:val="26"/>
+        </w:rPr>
+        <w:t>5</w:t>
+      </w:r>
+      <w:r>
+        <w:rPr>
+          <w:sz w:val="26"/>
+          <w:szCs w:val="26"/>
+        </w:rPr>
+        <w:t xml:space="preserve"> Troubleshooting</w:t>
+      </w:r>
+    </w:p>
+    <w:p>
+      <w:r>
+        <w:t>If pins become unplugged:</w:t>
+      </w:r>
+    </w:p>
+    <w:p>
+      <w:r>
+        <w:t>If connection not successful:</w:t>
+      </w:r>
+    </w:p>
+    <w:p>
+      <w:r>
+        <w:t>If transfer not successful:</w:t>
+      </w:r>
+    </w:p>
+    <w:p/>
+    <w:p>
+      <w:pPr>
+        <w:rPr>
+          <w:sz w:val="26"/>
+          <w:szCs w:val="26"/>
+        </w:rPr>
+      </w:pPr>
+      <w:r>
+        <w:rPr>
+          <w:sz w:val="26"/>
+          <w:szCs w:val="26"/>
+        </w:rPr>
+        <w:t xml:space="preserve">Section </w:t>
+      </w:r>
+      <w:r>
+        <w:rPr>
+          <w:sz w:val="26"/>
+          <w:szCs w:val="26"/>
+        </w:rPr>
+        <w:t>2</w:t>
+      </w:r>
+      <w:r>
+        <w:rPr>
+          <w:sz w:val="26"/>
+          <w:szCs w:val="26"/>
+        </w:rPr>
+        <w:t xml:space="preserve">: </w:t>
+      </w:r>
+      <w:r>
+        <w:rPr>
+          <w:sz w:val="26"/>
+          <w:szCs w:val="26"/>
+        </w:rPr>
+        <w:t>Hardware</w:t>
+      </w:r>
+      <w:r>
+        <w:rPr>
+          <w:sz w:val="26"/>
+          <w:szCs w:val="26"/>
+        </w:rPr>
+        <w:tab/>
+      </w:r>
+      <w:r>
+        <w:rPr>
+          <w:sz w:val="26"/>
+          <w:szCs w:val="26"/>
+        </w:rPr>
+        <w:tab/>
+      </w:r>
+      <w:r>
+        <w:rPr>
+          <w:sz w:val="26"/>
+          <w:szCs w:val="26"/>
+        </w:rPr>
+        <w:tab/>
+      </w:r>
+      <w:r>
+        <w:rPr>
+          <w:sz w:val="26"/>
+          <w:szCs w:val="26"/>
+        </w:rPr>
+        <w:tab/>
+        <w:t xml:space="preserve">    </w:t>
+      </w:r>
+      <w:r>
+        <w:rPr>
+          <w:sz w:val="26"/>
+          <w:szCs w:val="26"/>
+        </w:rPr>
+        <w:tab/>
+        <w:t xml:space="preserve">        2</w:t>
+      </w:r>
+      <w:r>
+        <w:rPr>
+          <w:sz w:val="26"/>
+          <w:szCs w:val="26"/>
+        </w:rPr>
+        <w:t>.</w:t>
+      </w:r>
+      <w:r>
+        <w:rPr>
+          <w:sz w:val="26"/>
+          <w:szCs w:val="26"/>
+        </w:rPr>
+        <w:t>1</w:t>
+      </w:r>
+      <w:r>
+        <w:rPr>
+          <w:sz w:val="26"/>
+          <w:szCs w:val="26"/>
+        </w:rPr>
+        <w:t xml:space="preserve"> </w:t>
+      </w:r>
+      <w:r>
+        <w:rPr>
+          <w:sz w:val="26"/>
+          <w:szCs w:val="26"/>
+        </w:rPr>
+        <w:t>Materials and Sources</w:t>
+      </w:r>
+    </w:p>
+    <w:p>
+      <w:r>
+        <w:t>Materials used to create the sensor platform and where they were purchased from</w:t>
+      </w:r>
+    </w:p>
+    <w:tbl>
+      <w:tblPr>
+        <w:tblStyle w:val="TableGrid"/>
+        <w:tblW w:w="0" w:type="auto"/>
+        <w:tblLook w:val="04A0" w:firstRow="1" w:lastRow="0" w:firstColumn="1" w:lastColumn="0" w:noHBand="0" w:noVBand="1"/>
+      </w:tblPr>
+      <w:tblGrid>
+        <w:gridCol w:w="2155"/>
+        <w:gridCol w:w="3992"/>
+        <w:gridCol w:w="3203"/>
+      </w:tblGrid>
+      <w:tr>
+        <w:tc>
+          <w:tcPr>
+            <w:tcW w:w="2155" w:type="dxa"/>
+          </w:tcPr>
+          <w:p>
+            <w:pPr>
+              <w:rPr>
+                <w:b/>
+                <w:bCs/>
+              </w:rPr>
+            </w:pPr>
+            <w:r>
+              <w:rPr>
+                <w:b/>
+                <w:bCs/>
+              </w:rPr>
+              <w:t>Function</w:t>
+            </w:r>
+          </w:p>
+        </w:tc>
+        <w:tc>
+          <w:tcPr>
+            <w:tcW w:w="3992" w:type="dxa"/>
+          </w:tcPr>
+          <w:p>
+            <w:pPr>
+              <w:rPr>
+                <w:b/>
+                <w:bCs/>
+              </w:rPr>
+            </w:pPr>
+            <w:r>
+              <w:rPr>
+                <w:b/>
+                <w:bCs/>
+              </w:rPr>
+              <w:t>Material</w:t>
+            </w:r>
+          </w:p>
+        </w:tc>
+        <w:tc>
+          <w:tcPr>
+            <w:tcW w:w="3203" w:type="dxa"/>
+          </w:tcPr>
+          <w:p>
+            <w:pPr>
+              <w:rPr>
+                <w:b/>
+                <w:bCs/>
+              </w:rPr>
+            </w:pPr>
+            <w:r>
+              <w:rPr>
+                <w:b/>
+                <w:bCs/>
+              </w:rPr>
+              <w:t>Source</w:t>
+            </w:r>
+          </w:p>
+        </w:tc>
+      </w:tr>
+      <w:tr>
+        <w:tc>
+          <w:tcPr>
+            <w:tcW w:w="2155" w:type="dxa"/>
+          </w:tcPr>
+          <w:p>
+            <w:r>
+              <w:t>Microcontroller</w:t>
+            </w:r>
+          </w:p>
+        </w:tc>
+        <w:tc>
+          <w:tcPr>
+            <w:tcW w:w="3992" w:type="dxa"/>
+          </w:tcPr>
+          <w:p>
+            <w:r>
+              <w:t>ESP32</w:t>
+            </w:r>
+          </w:p>
+        </w:tc>
+        <w:tc>
+          <w:tcPr>
+            <w:tcW w:w="3203" w:type="dxa"/>
+          </w:tcPr>
+          <w:p/>
+        </w:tc>
+      </w:tr>
+      <w:tr>
+        <w:tc>
+          <w:tcPr>
+            <w:tcW w:w="2155" w:type="dxa"/>
+          </w:tcPr>
+          <w:p>
+            <w:r>
+              <w:lastRenderedPageBreak/>
+              <w:t>Sensors</w:t>
+            </w:r>
+          </w:p>
+        </w:tc>
+        <w:tc>
+          <w:tcPr>
+            <w:tcW w:w="3992" w:type="dxa"/>
+          </w:tcPr>
+          <w:p>
+            <w:r>
+              <w:t>Magnetometer/Accelerometer</w:t>
+            </w:r>
+          </w:p>
+        </w:tc>
+        <w:tc>
+          <w:tcPr>
+            <w:tcW w:w="3203" w:type="dxa"/>
+          </w:tcPr>
+          <w:p>
+            <w:r>
+              <w:t>S</w:t>
+            </w:r>
+            <w:r>
+              <w:t>parkFun</w:t>
+            </w:r>
+          </w:p>
+        </w:tc>
+      </w:tr>
+      <w:tr>
+        <w:tc>
+          <w:tcPr>
+            <w:tcW w:w="2155" w:type="dxa"/>
+          </w:tcPr>
+          <w:p>
+            <w:r>
+              <w:t>Protection/Body</w:t>
+            </w:r>
+          </w:p>
+        </w:tc>
+        <w:tc>
+          <w:tcPr>
+            <w:tcW w:w="3992" w:type="dxa"/>
+          </w:tcPr>
+          <w:p>
+            <w:r>
+              <w:t>2” PVC pipe, 27in long</w:t>
+            </w:r>
+          </w:p>
+        </w:tc>
+        <w:tc>
+          <w:tcPr>
+            <w:tcW w:w="3203" w:type="dxa"/>
+          </w:tcPr>
+          <w:p/>
+        </w:tc>
+      </w:tr>
+      <w:tr>
+        <w:tc>
+          <w:tcPr>
+            <w:tcW w:w="2155" w:type="dxa"/>
+          </w:tcPr>
+          <w:p>
+            <w:r>
+              <w:t>Wires</w:t>
+            </w:r>
+          </w:p>
+        </w:tc>
+        <w:tc>
+          <w:tcPr>
+            <w:tcW w:w="3992" w:type="dxa"/>
+          </w:tcPr>
+          <w:p>
+            <w:r>
+              <w:t xml:space="preserve">12 gauge </w:t>
+            </w:r>
+            <w:r>
+              <w:t>insulated</w:t>
+            </w:r>
+            <w:r>
+              <w:t xml:space="preserve"> wire, copper core</w:t>
+            </w:r>
+          </w:p>
+        </w:tc>
+        <w:tc>
+          <w:tcPr>
+            <w:tcW w:w="3203" w:type="dxa"/>
+          </w:tcPr>
+          <w:p/>
+        </w:tc>
+      </w:tr>
+      <w:tr>
+        <w:tc>
+          <w:tcPr>
+            <w:tcW w:w="2155" w:type="dxa"/>
+          </w:tcPr>
+          <w:p>
+            <w:r>
+              <w:t>Storage</w:t>
+            </w:r>
+          </w:p>
+        </w:tc>
+        <w:tc>
+          <w:tcPr>
+            <w:tcW w:w="3992" w:type="dxa"/>
+          </w:tcPr>
+          <w:p>
+            <w:r>
+              <w:t>4GB SD Card</w:t>
+            </w:r>
+          </w:p>
+        </w:tc>
+        <w:tc>
+          <w:tcPr>
+            <w:tcW w:w="3203" w:type="dxa"/>
+          </w:tcPr>
+          <w:p>
+            <w:r>
+              <w:t>A</w:t>
+            </w:r>
+            <w:r>
+              <w:t>dafruit</w:t>
+            </w:r>
+          </w:p>
+        </w:tc>
+      </w:tr>
+    </w:tbl>
+    <w:p>
+      <w:pPr>
+        <w:jc w:val="right"/>
+        <w:rPr>
+          <w:sz w:val="26"/>
+          <w:szCs w:val="26"/>
+        </w:rPr>
+      </w:pPr>
+    </w:p>
+    <w:p>
+      <w:pPr>
+        <w:jc w:val="right"/>
+      </w:pPr>
+      <w:r>
+        <w:rPr>
+          <w:sz w:val="26"/>
+          <w:szCs w:val="26"/>
+        </w:rPr>
+        <w:t>2.</w:t>
+      </w:r>
+      <w:r>
+        <w:rPr>
+          <w:sz w:val="26"/>
+          <w:szCs w:val="26"/>
+        </w:rPr>
+        <w:t>2 Schematics</w:t>
+      </w:r>
+    </w:p>
+    <w:p/>
+    <w:p/>
+    <w:p>
+      <w:pPr>
+        <w:rPr>
+          <w:sz w:val="26"/>
+          <w:szCs w:val="26"/>
+        </w:rPr>
+      </w:pPr>
+      <w:r>
+        <w:rPr>
+          <w:sz w:val="26"/>
+          <w:szCs w:val="26"/>
+        </w:rPr>
+        <w:t xml:space="preserve">Section </w:t>
+      </w:r>
+      <w:r>
+        <w:rPr>
+          <w:sz w:val="26"/>
+          <w:szCs w:val="26"/>
+        </w:rPr>
+        <w:t>3</w:t>
+      </w:r>
+      <w:r>
+        <w:rPr>
+          <w:sz w:val="26"/>
+          <w:szCs w:val="26"/>
+        </w:rPr>
+        <w:t xml:space="preserve">: </w:t>
+      </w:r>
+      <w:r>
+        <w:rPr>
+          <w:sz w:val="26"/>
+          <w:szCs w:val="26"/>
+        </w:rPr>
+        <w:t>Software</w:t>
+      </w:r>
+    </w:p>
+    <w:p>
+      <w:r>
+        <w:t xml:space="preserve">All of the software is accessible through the github: </w:t>
+      </w:r>
+      <w:hyperlink r:id="rId6" w:history="1">
+        <w:r>
+          <w:rPr>
+            <w:rStyle w:val="Hyperlink"/>
+          </w:rPr>
+          <w:t>zanderalbaz/EBike-Data-Logger</w:t>
+        </w:r>
+      </w:hyperlink>
+    </w:p>
+    <w:p>
+      <w:pPr>
+        <w:rPr>
+          <w:sz w:val="26"/>
+          <w:szCs w:val="26"/>
+        </w:rPr>
+      </w:pPr>
+    </w:p>
+    <w:p>
+      <w:pPr>
+        <w:rPr>
+          <w:sz w:val="26"/>
+          <w:szCs w:val="26"/>
+        </w:rPr>
+      </w:pPr>
+      <w:r>
+        <w:rPr>
+          <w:sz w:val="26"/>
+          <w:szCs w:val="26"/>
+        </w:rPr>
+        <w:tab/>
+      </w:r>
+      <w:r>
+        <w:rPr>
+          <w:sz w:val="26"/>
+          <w:szCs w:val="26"/>
+        </w:rPr>
+        <w:tab/>
+        <w:t xml:space="preserve">   </w:t>
+      </w:r>
+      <w:r>
+        <w:rPr>
+          <w:sz w:val="26"/>
+          <w:szCs w:val="26"/>
+        </w:rPr>
+        <w:tab/>
+      </w:r>
+      <w:r>
+        <w:rPr>
+          <w:sz w:val="26"/>
+          <w:szCs w:val="26"/>
+        </w:rPr>
+        <w:tab/>
+      </w:r>
+      <w:r>
+        <w:rPr>
+          <w:sz w:val="26"/>
+          <w:szCs w:val="26"/>
+        </w:rPr>
+        <w:tab/>
+      </w:r>
+      <w:r>
+        <w:rPr>
+          <w:sz w:val="26"/>
+          <w:szCs w:val="26"/>
+        </w:rPr>
+        <w:tab/>
+      </w:r>
+      <w:r>
+        <w:rPr>
+          <w:sz w:val="26"/>
+          <w:szCs w:val="26"/>
+        </w:rPr>
+        <w:tab/>
+      </w:r>
+      <w:r>
+        <w:rPr>
+          <w:sz w:val="26"/>
+          <w:szCs w:val="26"/>
+        </w:rPr>
+        <w:tab/>
+      </w:r>
+      <w:r>
+        <w:rPr>
+          <w:sz w:val="26"/>
+          <w:szCs w:val="26"/>
+        </w:rPr>
+        <w:tab/>
+        <w:t xml:space="preserve"> </w:t>
+      </w:r>
+      <w:r>
+        <w:rPr>
+          <w:sz w:val="26"/>
+          <w:szCs w:val="26"/>
+        </w:rPr>
+        <w:t xml:space="preserve"> </w:t>
+      </w:r>
+      <w:r>
+        <w:rPr>
+          <w:sz w:val="26"/>
+          <w:szCs w:val="26"/>
+        </w:rPr>
+        <w:t>3</w:t>
+      </w:r>
+      <w:r>
+        <w:rPr>
+          <w:sz w:val="26"/>
+          <w:szCs w:val="26"/>
+        </w:rPr>
+        <w:t xml:space="preserve">.1 </w:t>
+      </w:r>
+      <w:r>
+        <w:rPr>
+          <w:sz w:val="26"/>
+          <w:szCs w:val="26"/>
+        </w:rPr>
+        <w:t>Desktop Application</w:t>
+      </w:r>
+    </w:p>
+    <w:p>
+      <w:r>
+        <w:t>The desktop application was created in Java using the Intellij IDE on a Windows machine</w:t>
+      </w:r>
+      <w:r>
+        <w:t xml:space="preserve"> with Oracle OpenJDK 23.0.1 with a language level 17. It requires jSerialComm-2.11.0.jar. </w:t>
+      </w:r>
+      <w:r>
+        <w:t xml:space="preserve">The </w:t>
+      </w:r>
+      <w:r>
+        <w:t xml:space="preserve">source </w:t>
+      </w:r>
+      <w:r>
+        <w:t>code was compiled into an executable using jPackage.</w:t>
+      </w:r>
+    </w:p>
+    <w:p>
+      <w:r>
+        <w:t>PACKAGES &amp; DEPENDENCIES</w:t>
+      </w:r>
+      <w:r>
+        <w:t>, Libraries??</w:t>
+      </w:r>
+    </w:p>
+    <w:p>
+      <w:pPr>
+        <w:jc w:val="right"/>
+        <w:rPr>
+          <w:sz w:val="26"/>
+          <w:szCs w:val="26"/>
+        </w:rPr>
+      </w:pPr>
+      <w:r>
+        <w:rPr>
+          <w:sz w:val="26"/>
+          <w:szCs w:val="26"/>
+        </w:rPr>
+        <w:t>3.</w:t>
+      </w:r>
+      <w:r>
+        <w:rPr>
+          <w:sz w:val="26"/>
+          <w:szCs w:val="26"/>
+        </w:rPr>
+        <w:t>2</w:t>
+      </w:r>
+      <w:r>
+        <w:rPr>
+          <w:sz w:val="26"/>
+          <w:szCs w:val="26"/>
+        </w:rPr>
+        <w:t xml:space="preserve"> </w:t>
+      </w:r>
+      <w:r>
+        <w:rPr>
+          <w:sz w:val="26"/>
+          <w:szCs w:val="26"/>
+        </w:rPr>
+        <w:t>Microcontroller Code</w:t>
+      </w:r>
+    </w:p>
+    <w:p>
+      <w:r>
+        <w:t>The code for the ESP32 was coded in C++ and created in the Arduino IDE version 1.8.12. Libraries: Adafruit BusIO, Adafruit MLX90393, SparkFun 9DoF IMU Breakout – ICM 20948 – Arduino Library</w:t>
+      </w:r>
+      <w:r>
+        <w:t xml:space="preserve">, Adafruit Unified Sensor in addition to the Built-in libraries. </w:t>
+      </w:r>
+    </w:p>
+    <w:p/>
+    <w:p>
+      <w:pPr>
+        <w:jc w:val="right"/>
+        <w:rPr>
+          <w:sz w:val="26"/>
+          <w:szCs w:val="26"/>
+        </w:rPr>
+      </w:pPr>
+      <w:r>
+        <w:rPr>
+          <w:sz w:val="26"/>
+          <w:szCs w:val="26"/>
+        </w:rPr>
+        <w:t>3.3 Machine Learning &amp; Preprocessing</w:t>
+      </w:r>
+    </w:p>
+    <w:p>
+      <w:r>
+        <w:t>The machine learning and preprocessing algorithms were scripted and trained in python using Jupyter Notebook, where they were ported to a .json file that we then included as a header in the microcontroller code.</w:t>
+      </w:r>
+      <w:r>
+        <w:t xml:space="preserve"> The preprocessing algorithm takes in a 18x50 table (18 columns over 50 collections) and returns </w:t>
+      </w:r>
+      <w:r>
+        <w:t xml:space="preserve">summary satistics. The summary satistics used are average, standard deviation and upper and lower quartile. This reduces it to a 18x4 table, which is then flattened into a single row (1x72) to pass to the algorithm. </w:t>
+      </w:r>
+      <w:r>
+        <w:t>The algorithm used is a XGBoost algorithm with the following parameters: XGBOOST PARAMETERS.</w:t>
+      </w:r>
+    </w:p>
+    <w:p/>
     <w:sectPr>
       <w:pgSz w:w="12240" w:h="15840"/>
       <w:pgMar w:top="1440" w:right="1440" w:bottom="1440" w:left="1440" w:header="720" w:footer="720" w:gutter="0"/>
@@ -263,6 +1541,571 @@
 <file path=word/numbering.xml><?xml version="1.0" encoding="utf-8"?>
 <w:numbering xmlns:wpc="http://schemas.microsoft.com/office/word/2010/wordprocessingCanvas" xmlns:cx="http://schemas.microsoft.com/office/drawing/2014/chartex" xmlns:cx1="http://schemas.microsoft.com/office/drawing/2015/9/8/chartex" xmlns:cx2="http://schemas.microsoft.com/office/drawing/2015/10/21/chartex" xmlns:cx3="http://schemas.microsoft.com/office/drawing/2016/5/9/chartex" xmlns:cx4="http://schemas.microsoft.com/office/drawing/2016/5/10/chartex" xmlns:cx5="http://schemas.microsoft.com/office/drawing/2016/5/11/chartex" xmlns:cx6="http://schemas.microsoft.com/office/drawing/2016/5/12/chartex" xmlns:cx7="http://schemas.microsoft.com/office/drawing/2016/5/13/chartex" xmlns:cx8="http://schemas.microsoft.com/office/drawing/2016/5/14/chartex" xmlns:mc="http://schemas.openxmlformats.org/markup-compatibility/2006" xmlns:aink="http://schemas.microsoft.com/office/drawing/2016/ink" xmlns:am3d="http://schemas.microsoft.com/office/drawing/2017/model3d" xmlns:o="urn:schemas-microsoft-com:office:office" xmlns:oel="http://schemas.microsoft.com/office/2019/extlst" xmlns:r="http://schemas.openxmlformats.org/officeDocument/2006/relationships" xmlns:m="http://schemas.openxmlformats.org/officeDocument/2006/math" xmlns:v="urn:schemas-microsoft-com:vml" xmlns:wp14="http://schemas.microsoft.com/office/word/2010/wordprocessingDrawing" xmlns:wp="http://schemas.openxmlformats.org/drawingml/2006/wordprocessingDrawing" xmlns:w10="urn:schemas-microsoft-com:office:word" xmlns:w="http://schemas.openxmlformats.org/wordprocessingml/2006/main" xmlns:w14="http://schemas.microsoft.com/office/word/2010/wordml" xmlns:w15="http://schemas.microsoft.com/office/word/2012/wordml" xmlns:w16cex="http://schemas.microsoft.com/office/word/2018/wordml/cex" xmlns:w16cid="http://schemas.microsoft.com/office/word/2016/wordml/cid" xmlns:w16="http://schemas.microsoft.com/office/word/2018/wordml" xmlns:w16du="http://schemas.microsoft.com/office/word/2023/wordml/word16du" xmlns:w16sdtdh="http://schemas.microsoft.com/office/word/2020/wordml/sdtdatahash" xmlns:w16sdtfl="http://schemas.microsoft.com/office/word/2024/wordml/sdtformatlock" xmlns:w16se="http://schemas.microsoft.com/office/word/2015/wordml/symex" xmlns:wpg="http://schemas.microsoft.com/office/word/2010/wordprocessingGroup" xmlns:wpi="http://schemas.microsoft.com/office/word/2010/wordprocessingInk" xmlns:wne="http://schemas.microsoft.com/office/word/2006/wordml" xmlns:wps="http://schemas.microsoft.com/office/word/2010/wordprocessingShape" mc:Ignorable="w14 w15 w16se w16cid w16 w16cex w16sdtdh w16sdtfl w16du wp14">
   <w:abstractNum w:abstractNumId="0" w15:restartNumberingAfterBreak="0">
+    <w:nsid w:val="2FFF0E6E"/>
+    <w:multiLevelType w:val="hybridMultilevel"/>
+    <w:tmpl w:val="7EF85010"/>
+    <w:lvl w:ilvl="0" w:tplc="04090001">
+      <w:start w:val="1"/>
+      <w:numFmt w:val="bullet"/>
+      <w:lvlText w:val=""/>
+      <w:lvlJc w:val="left"/>
+      <w:pPr>
+        <w:ind w:left="720" w:hanging="360"/>
+      </w:pPr>
+      <w:rPr>
+        <w:rFonts w:ascii="Symbol" w:hAnsi="Symbol" w:hint="default"/>
+      </w:rPr>
+    </w:lvl>
+    <w:lvl w:ilvl="1" w:tplc="04090003">
+      <w:start w:val="1"/>
+      <w:numFmt w:val="bullet"/>
+      <w:lvlText w:val="o"/>
+      <w:lvlJc w:val="left"/>
+      <w:pPr>
+        <w:ind w:left="1440" w:hanging="360"/>
+      </w:pPr>
+      <w:rPr>
+        <w:rFonts w:ascii="Courier New" w:hAnsi="Courier New" w:cs="Courier New" w:hint="default"/>
+      </w:rPr>
+    </w:lvl>
+    <w:lvl w:ilvl="2" w:tplc="04090005" w:tentative="1">
+      <w:start w:val="1"/>
+      <w:numFmt w:val="bullet"/>
+      <w:lvlText w:val=""/>
+      <w:lvlJc w:val="left"/>
+      <w:pPr>
+        <w:ind w:left="2160" w:hanging="360"/>
+      </w:pPr>
+      <w:rPr>
+        <w:rFonts w:ascii="Wingdings" w:hAnsi="Wingdings" w:hint="default"/>
+      </w:rPr>
+    </w:lvl>
+    <w:lvl w:ilvl="3" w:tplc="04090001" w:tentative="1">
+      <w:start w:val="1"/>
+      <w:numFmt w:val="bullet"/>
+      <w:lvlText w:val=""/>
+      <w:lvlJc w:val="left"/>
+      <w:pPr>
+        <w:ind w:left="2880" w:hanging="360"/>
+      </w:pPr>
+      <w:rPr>
+        <w:rFonts w:ascii="Symbol" w:hAnsi="Symbol" w:hint="default"/>
+      </w:rPr>
+    </w:lvl>
+    <w:lvl w:ilvl="4" w:tplc="04090003" w:tentative="1">
+      <w:start w:val="1"/>
+      <w:numFmt w:val="bullet"/>
+      <w:lvlText w:val="o"/>
+      <w:lvlJc w:val="left"/>
+      <w:pPr>
+        <w:ind w:left="3600" w:hanging="360"/>
+      </w:pPr>
+      <w:rPr>
+        <w:rFonts w:ascii="Courier New" w:hAnsi="Courier New" w:cs="Courier New" w:hint="default"/>
+      </w:rPr>
+    </w:lvl>
+    <w:lvl w:ilvl="5" w:tplc="04090005" w:tentative="1">
+      <w:start w:val="1"/>
+      <w:numFmt w:val="bullet"/>
+      <w:lvlText w:val=""/>
+      <w:lvlJc w:val="left"/>
+      <w:pPr>
+        <w:ind w:left="4320" w:hanging="360"/>
+      </w:pPr>
+      <w:rPr>
+        <w:rFonts w:ascii="Wingdings" w:hAnsi="Wingdings" w:hint="default"/>
+      </w:rPr>
+    </w:lvl>
+    <w:lvl w:ilvl="6" w:tplc="04090001" w:tentative="1">
+      <w:start w:val="1"/>
+      <w:numFmt w:val="bullet"/>
+      <w:lvlText w:val=""/>
+      <w:lvlJc w:val="left"/>
+      <w:pPr>
+        <w:ind w:left="5040" w:hanging="360"/>
+      </w:pPr>
+      <w:rPr>
+        <w:rFonts w:ascii="Symbol" w:hAnsi="Symbol" w:hint="default"/>
+      </w:rPr>
+    </w:lvl>
+    <w:lvl w:ilvl="7" w:tplc="04090003" w:tentative="1">
+      <w:start w:val="1"/>
+      <w:numFmt w:val="bullet"/>
+      <w:lvlText w:val="o"/>
+      <w:lvlJc w:val="left"/>
+      <w:pPr>
+        <w:ind w:left="5760" w:hanging="360"/>
+      </w:pPr>
+      <w:rPr>
+        <w:rFonts w:ascii="Courier New" w:hAnsi="Courier New" w:cs="Courier New" w:hint="default"/>
+      </w:rPr>
+    </w:lvl>
+    <w:lvl w:ilvl="8" w:tplc="04090005" w:tentative="1">
+      <w:start w:val="1"/>
+      <w:numFmt w:val="bullet"/>
+      <w:lvlText w:val=""/>
+      <w:lvlJc w:val="left"/>
+      <w:pPr>
+        <w:ind w:left="6480" w:hanging="360"/>
+      </w:pPr>
+      <w:rPr>
+        <w:rFonts w:ascii="Wingdings" w:hAnsi="Wingdings" w:hint="default"/>
+      </w:rPr>
+    </w:lvl>
+  </w:abstractNum>
+  <w:abstractNum w:abstractNumId="1" w15:restartNumberingAfterBreak="0">
+    <w:nsid w:val="30B30DA4"/>
+    <w:multiLevelType w:val="multilevel"/>
+    <w:tmpl w:val="08AC12CA"/>
+    <w:lvl w:ilvl="0">
+      <w:start w:val="1"/>
+      <w:numFmt w:val="decimal"/>
+      <w:lvlText w:val="%1"/>
+      <w:lvlJc w:val="left"/>
+      <w:pPr>
+        <w:ind w:left="360" w:hanging="360"/>
+      </w:pPr>
+      <w:rPr>
+        <w:rFonts w:hint="default"/>
+      </w:rPr>
+    </w:lvl>
+    <w:lvl w:ilvl="1">
+      <w:start w:val="1"/>
+      <w:numFmt w:val="decimal"/>
+      <w:lvlText w:val="%1.%2"/>
+      <w:lvlJc w:val="left"/>
+      <w:pPr>
+        <w:ind w:left="1080" w:hanging="360"/>
+      </w:pPr>
+      <w:rPr>
+        <w:rFonts w:hint="default"/>
+      </w:rPr>
+    </w:lvl>
+    <w:lvl w:ilvl="2">
+      <w:start w:val="1"/>
+      <w:numFmt w:val="decimal"/>
+      <w:lvlText w:val="%1.%2.%3"/>
+      <w:lvlJc w:val="left"/>
+      <w:pPr>
+        <w:ind w:left="2160" w:hanging="720"/>
+      </w:pPr>
+      <w:rPr>
+        <w:rFonts w:hint="default"/>
+      </w:rPr>
+    </w:lvl>
+    <w:lvl w:ilvl="3">
+      <w:start w:val="1"/>
+      <w:numFmt w:val="decimal"/>
+      <w:lvlText w:val="%1.%2.%3.%4"/>
+      <w:lvlJc w:val="left"/>
+      <w:pPr>
+        <w:ind w:left="2880" w:hanging="720"/>
+      </w:pPr>
+      <w:rPr>
+        <w:rFonts w:hint="default"/>
+      </w:rPr>
+    </w:lvl>
+    <w:lvl w:ilvl="4">
+      <w:start w:val="1"/>
+      <w:numFmt w:val="decimal"/>
+      <w:lvlText w:val="%1.%2.%3.%4.%5"/>
+      <w:lvlJc w:val="left"/>
+      <w:pPr>
+        <w:ind w:left="3960" w:hanging="1080"/>
+      </w:pPr>
+      <w:rPr>
+        <w:rFonts w:hint="default"/>
+      </w:rPr>
+    </w:lvl>
+    <w:lvl w:ilvl="5">
+      <w:start w:val="1"/>
+      <w:numFmt w:val="decimal"/>
+      <w:lvlText w:val="%1.%2.%3.%4.%5.%6"/>
+      <w:lvlJc w:val="left"/>
+      <w:pPr>
+        <w:ind w:left="4680" w:hanging="1080"/>
+      </w:pPr>
+      <w:rPr>
+        <w:rFonts w:hint="default"/>
+      </w:rPr>
+    </w:lvl>
+    <w:lvl w:ilvl="6">
+      <w:start w:val="1"/>
+      <w:numFmt w:val="decimal"/>
+      <w:lvlText w:val="%1.%2.%3.%4.%5.%6.%7"/>
+      <w:lvlJc w:val="left"/>
+      <w:pPr>
+        <w:ind w:left="5760" w:hanging="1440"/>
+      </w:pPr>
+      <w:rPr>
+        <w:rFonts w:hint="default"/>
+      </w:rPr>
+    </w:lvl>
+    <w:lvl w:ilvl="7">
+      <w:start w:val="1"/>
+      <w:numFmt w:val="decimal"/>
+      <w:lvlText w:val="%1.%2.%3.%4.%5.%6.%7.%8"/>
+      <w:lvlJc w:val="left"/>
+      <w:pPr>
+        <w:ind w:left="6480" w:hanging="1440"/>
+      </w:pPr>
+      <w:rPr>
+        <w:rFonts w:hint="default"/>
+      </w:rPr>
+    </w:lvl>
+    <w:lvl w:ilvl="8">
+      <w:start w:val="1"/>
+      <w:numFmt w:val="decimal"/>
+      <w:lvlText w:val="%1.%2.%3.%4.%5.%6.%7.%8.%9"/>
+      <w:lvlJc w:val="left"/>
+      <w:pPr>
+        <w:ind w:left="7560" w:hanging="1800"/>
+      </w:pPr>
+      <w:rPr>
+        <w:rFonts w:hint="default"/>
+      </w:rPr>
+    </w:lvl>
+  </w:abstractNum>
+  <w:abstractNum w:abstractNumId="2" w15:restartNumberingAfterBreak="0">
+    <w:nsid w:val="38F71E38"/>
+    <w:multiLevelType w:val="multilevel"/>
+    <w:tmpl w:val="1AC43A52"/>
+    <w:lvl w:ilvl="0">
+      <w:start w:val="1"/>
+      <w:numFmt w:val="decimal"/>
+      <w:lvlText w:val="%1."/>
+      <w:lvlJc w:val="left"/>
+      <w:pPr>
+        <w:ind w:left="432" w:hanging="432"/>
+      </w:pPr>
+      <w:rPr>
+        <w:rFonts w:hint="default"/>
+      </w:rPr>
+    </w:lvl>
+    <w:lvl w:ilvl="1">
+      <w:start w:val="1"/>
+      <w:numFmt w:val="decimal"/>
+      <w:lvlText w:val="%1.%2."/>
+      <w:lvlJc w:val="left"/>
+      <w:pPr>
+        <w:ind w:left="1440" w:hanging="720"/>
+      </w:pPr>
+      <w:rPr>
+        <w:rFonts w:hint="default"/>
+      </w:rPr>
+    </w:lvl>
+    <w:lvl w:ilvl="2">
+      <w:start w:val="1"/>
+      <w:numFmt w:val="decimal"/>
+      <w:lvlText w:val="%1.%2.%3."/>
+      <w:lvlJc w:val="left"/>
+      <w:pPr>
+        <w:ind w:left="2160" w:hanging="720"/>
+      </w:pPr>
+      <w:rPr>
+        <w:rFonts w:hint="default"/>
+      </w:rPr>
+    </w:lvl>
+    <w:lvl w:ilvl="3">
+      <w:start w:val="1"/>
+      <w:numFmt w:val="decimal"/>
+      <w:lvlText w:val="%1.%2.%3.%4."/>
+      <w:lvlJc w:val="left"/>
+      <w:pPr>
+        <w:ind w:left="3240" w:hanging="1080"/>
+      </w:pPr>
+      <w:rPr>
+        <w:rFonts w:hint="default"/>
+      </w:rPr>
+    </w:lvl>
+    <w:lvl w:ilvl="4">
+      <w:start w:val="1"/>
+      <w:numFmt w:val="decimal"/>
+      <w:lvlText w:val="%1.%2.%3.%4.%5."/>
+      <w:lvlJc w:val="left"/>
+      <w:pPr>
+        <w:ind w:left="3960" w:hanging="1080"/>
+      </w:pPr>
+      <w:rPr>
+        <w:rFonts w:hint="default"/>
+      </w:rPr>
+    </w:lvl>
+    <w:lvl w:ilvl="5">
+      <w:start w:val="1"/>
+      <w:numFmt w:val="decimal"/>
+      <w:lvlText w:val="%1.%2.%3.%4.%5.%6."/>
+      <w:lvlJc w:val="left"/>
+      <w:pPr>
+        <w:ind w:left="5040" w:hanging="1440"/>
+      </w:pPr>
+      <w:rPr>
+        <w:rFonts w:hint="default"/>
+      </w:rPr>
+    </w:lvl>
+    <w:lvl w:ilvl="6">
+      <w:start w:val="1"/>
+      <w:numFmt w:val="decimal"/>
+      <w:lvlText w:val="%1.%2.%3.%4.%5.%6.%7."/>
+      <w:lvlJc w:val="left"/>
+      <w:pPr>
+        <w:ind w:left="5760" w:hanging="1440"/>
+      </w:pPr>
+      <w:rPr>
+        <w:rFonts w:hint="default"/>
+      </w:rPr>
+    </w:lvl>
+    <w:lvl w:ilvl="7">
+      <w:start w:val="1"/>
+      <w:numFmt w:val="decimal"/>
+      <w:lvlText w:val="%1.%2.%3.%4.%5.%6.%7.%8."/>
+      <w:lvlJc w:val="left"/>
+      <w:pPr>
+        <w:ind w:left="6840" w:hanging="1800"/>
+      </w:pPr>
+      <w:rPr>
+        <w:rFonts w:hint="default"/>
+      </w:rPr>
+    </w:lvl>
+    <w:lvl w:ilvl="8">
+      <w:start w:val="1"/>
+      <w:numFmt w:val="decimal"/>
+      <w:lvlText w:val="%1.%2.%3.%4.%5.%6.%7.%8.%9."/>
+      <w:lvlJc w:val="left"/>
+      <w:pPr>
+        <w:ind w:left="7560" w:hanging="1800"/>
+      </w:pPr>
+      <w:rPr>
+        <w:rFonts w:hint="default"/>
+      </w:rPr>
+    </w:lvl>
+  </w:abstractNum>
+  <w:abstractNum w:abstractNumId="3" w15:restartNumberingAfterBreak="0">
+    <w:nsid w:val="63BA31E8"/>
+    <w:multiLevelType w:val="hybridMultilevel"/>
+    <w:tmpl w:val="7BEEE510"/>
+    <w:lvl w:ilvl="0" w:tplc="04090001">
+      <w:start w:val="1"/>
+      <w:numFmt w:val="bullet"/>
+      <w:lvlText w:val=""/>
+      <w:lvlJc w:val="left"/>
+      <w:pPr>
+        <w:ind w:left="720" w:hanging="360"/>
+      </w:pPr>
+      <w:rPr>
+        <w:rFonts w:ascii="Symbol" w:hAnsi="Symbol" w:hint="default"/>
+      </w:rPr>
+    </w:lvl>
+    <w:lvl w:ilvl="1" w:tplc="04090003" w:tentative="1">
+      <w:start w:val="1"/>
+      <w:numFmt w:val="bullet"/>
+      <w:lvlText w:val="o"/>
+      <w:lvlJc w:val="left"/>
+      <w:pPr>
+        <w:ind w:left="1440" w:hanging="360"/>
+      </w:pPr>
+      <w:rPr>
+        <w:rFonts w:ascii="Courier New" w:hAnsi="Courier New" w:cs="Courier New" w:hint="default"/>
+      </w:rPr>
+    </w:lvl>
+    <w:lvl w:ilvl="2" w:tplc="04090005" w:tentative="1">
+      <w:start w:val="1"/>
+      <w:numFmt w:val="bullet"/>
+      <w:lvlText w:val=""/>
+      <w:lvlJc w:val="left"/>
+      <w:pPr>
+        <w:ind w:left="2160" w:hanging="360"/>
+      </w:pPr>
+      <w:rPr>
+        <w:rFonts w:ascii="Wingdings" w:hAnsi="Wingdings" w:hint="default"/>
+      </w:rPr>
+    </w:lvl>
+    <w:lvl w:ilvl="3" w:tplc="04090001" w:tentative="1">
+      <w:start w:val="1"/>
+      <w:numFmt w:val="bullet"/>
+      <w:lvlText w:val=""/>
+      <w:lvlJc w:val="left"/>
+      <w:pPr>
+        <w:ind w:left="2880" w:hanging="360"/>
+      </w:pPr>
+      <w:rPr>
+        <w:rFonts w:ascii="Symbol" w:hAnsi="Symbol" w:hint="default"/>
+      </w:rPr>
+    </w:lvl>
+    <w:lvl w:ilvl="4" w:tplc="04090003" w:tentative="1">
+      <w:start w:val="1"/>
+      <w:numFmt w:val="bullet"/>
+      <w:lvlText w:val="o"/>
+      <w:lvlJc w:val="left"/>
+      <w:pPr>
+        <w:ind w:left="3600" w:hanging="360"/>
+      </w:pPr>
+      <w:rPr>
+        <w:rFonts w:ascii="Courier New" w:hAnsi="Courier New" w:cs="Courier New" w:hint="default"/>
+      </w:rPr>
+    </w:lvl>
+    <w:lvl w:ilvl="5" w:tplc="04090005" w:tentative="1">
+      <w:start w:val="1"/>
+      <w:numFmt w:val="bullet"/>
+      <w:lvlText w:val=""/>
+      <w:lvlJc w:val="left"/>
+      <w:pPr>
+        <w:ind w:left="4320" w:hanging="360"/>
+      </w:pPr>
+      <w:rPr>
+        <w:rFonts w:ascii="Wingdings" w:hAnsi="Wingdings" w:hint="default"/>
+      </w:rPr>
+    </w:lvl>
+    <w:lvl w:ilvl="6" w:tplc="04090001" w:tentative="1">
+      <w:start w:val="1"/>
+      <w:numFmt w:val="bullet"/>
+      <w:lvlText w:val=""/>
+      <w:lvlJc w:val="left"/>
+      <w:pPr>
+        <w:ind w:left="5040" w:hanging="360"/>
+      </w:pPr>
+      <w:rPr>
+        <w:rFonts w:ascii="Symbol" w:hAnsi="Symbol" w:hint="default"/>
+      </w:rPr>
+    </w:lvl>
+    <w:lvl w:ilvl="7" w:tplc="04090003" w:tentative="1">
+      <w:start w:val="1"/>
+      <w:numFmt w:val="bullet"/>
+      <w:lvlText w:val="o"/>
+      <w:lvlJc w:val="left"/>
+      <w:pPr>
+        <w:ind w:left="5760" w:hanging="360"/>
+      </w:pPr>
+      <w:rPr>
+        <w:rFonts w:ascii="Courier New" w:hAnsi="Courier New" w:cs="Courier New" w:hint="default"/>
+      </w:rPr>
+    </w:lvl>
+    <w:lvl w:ilvl="8" w:tplc="04090005" w:tentative="1">
+      <w:start w:val="1"/>
+      <w:numFmt w:val="bullet"/>
+      <w:lvlText w:val=""/>
+      <w:lvlJc w:val="left"/>
+      <w:pPr>
+        <w:ind w:left="6480" w:hanging="360"/>
+      </w:pPr>
+      <w:rPr>
+        <w:rFonts w:ascii="Wingdings" w:hAnsi="Wingdings" w:hint="default"/>
+      </w:rPr>
+    </w:lvl>
+  </w:abstractNum>
+  <w:abstractNum w:abstractNumId="4" w15:restartNumberingAfterBreak="0">
+    <w:nsid w:val="65E0033E"/>
+    <w:multiLevelType w:val="hybridMultilevel"/>
+    <w:tmpl w:val="198A47C0"/>
+    <w:lvl w:ilvl="0" w:tplc="04090001">
+      <w:start w:val="1"/>
+      <w:numFmt w:val="bullet"/>
+      <w:lvlText w:val=""/>
+      <w:lvlJc w:val="left"/>
+      <w:pPr>
+        <w:ind w:left="720" w:hanging="360"/>
+      </w:pPr>
+      <w:rPr>
+        <w:rFonts w:ascii="Symbol" w:hAnsi="Symbol" w:hint="default"/>
+      </w:rPr>
+    </w:lvl>
+    <w:lvl w:ilvl="1" w:tplc="04090003" w:tentative="1">
+      <w:start w:val="1"/>
+      <w:numFmt w:val="bullet"/>
+      <w:lvlText w:val="o"/>
+      <w:lvlJc w:val="left"/>
+      <w:pPr>
+        <w:ind w:left="1440" w:hanging="360"/>
+      </w:pPr>
+      <w:rPr>
+        <w:rFonts w:ascii="Courier New" w:hAnsi="Courier New" w:cs="Courier New" w:hint="default"/>
+      </w:rPr>
+    </w:lvl>
+    <w:lvl w:ilvl="2" w:tplc="04090005" w:tentative="1">
+      <w:start w:val="1"/>
+      <w:numFmt w:val="bullet"/>
+      <w:lvlText w:val=""/>
+      <w:lvlJc w:val="left"/>
+      <w:pPr>
+        <w:ind w:left="2160" w:hanging="360"/>
+      </w:pPr>
+      <w:rPr>
+        <w:rFonts w:ascii="Wingdings" w:hAnsi="Wingdings" w:hint="default"/>
+      </w:rPr>
+    </w:lvl>
+    <w:lvl w:ilvl="3" w:tplc="04090001" w:tentative="1">
+      <w:start w:val="1"/>
+      <w:numFmt w:val="bullet"/>
+      <w:lvlText w:val=""/>
+      <w:lvlJc w:val="left"/>
+      <w:pPr>
+        <w:ind w:left="2880" w:hanging="360"/>
+      </w:pPr>
+      <w:rPr>
+        <w:rFonts w:ascii="Symbol" w:hAnsi="Symbol" w:hint="default"/>
+      </w:rPr>
+    </w:lvl>
+    <w:lvl w:ilvl="4" w:tplc="04090003" w:tentative="1">
+      <w:start w:val="1"/>
+      <w:numFmt w:val="bullet"/>
+      <w:lvlText w:val="o"/>
+      <w:lvlJc w:val="left"/>
+      <w:pPr>
+        <w:ind w:left="3600" w:hanging="360"/>
+      </w:pPr>
+      <w:rPr>
+        <w:rFonts w:ascii="Courier New" w:hAnsi="Courier New" w:cs="Courier New" w:hint="default"/>
+      </w:rPr>
+    </w:lvl>
+    <w:lvl w:ilvl="5" w:tplc="04090005" w:tentative="1">
+      <w:start w:val="1"/>
+      <w:numFmt w:val="bullet"/>
+      <w:lvlText w:val=""/>
+      <w:lvlJc w:val="left"/>
+      <w:pPr>
+        <w:ind w:left="4320" w:hanging="360"/>
+      </w:pPr>
+      <w:rPr>
+        <w:rFonts w:ascii="Wingdings" w:hAnsi="Wingdings" w:hint="default"/>
+      </w:rPr>
+    </w:lvl>
+    <w:lvl w:ilvl="6" w:tplc="04090001" w:tentative="1">
+      <w:start w:val="1"/>
+      <w:numFmt w:val="bullet"/>
+      <w:lvlText w:val=""/>
+      <w:lvlJc w:val="left"/>
+      <w:pPr>
+        <w:ind w:left="5040" w:hanging="360"/>
+      </w:pPr>
+      <w:rPr>
+        <w:rFonts w:ascii="Symbol" w:hAnsi="Symbol" w:hint="default"/>
+      </w:rPr>
+    </w:lvl>
+    <w:lvl w:ilvl="7" w:tplc="04090003" w:tentative="1">
+      <w:start w:val="1"/>
+      <w:numFmt w:val="bullet"/>
+      <w:lvlText w:val="o"/>
+      <w:lvlJc w:val="left"/>
+      <w:pPr>
+        <w:ind w:left="5760" w:hanging="360"/>
+      </w:pPr>
+      <w:rPr>
+        <w:rFonts w:ascii="Courier New" w:hAnsi="Courier New" w:cs="Courier New" w:hint="default"/>
+      </w:rPr>
+    </w:lvl>
+    <w:lvl w:ilvl="8" w:tplc="04090005" w:tentative="1">
+      <w:start w:val="1"/>
+      <w:numFmt w:val="bullet"/>
+      <w:lvlText w:val=""/>
+      <w:lvlJc w:val="left"/>
+      <w:pPr>
+        <w:ind w:left="6480" w:hanging="360"/>
+      </w:pPr>
+      <w:rPr>
+        <w:rFonts w:ascii="Wingdings" w:hAnsi="Wingdings" w:hint="default"/>
+      </w:rPr>
+    </w:lvl>
+  </w:abstractNum>
+  <w:abstractNum w:abstractNumId="5" w15:restartNumberingAfterBreak="0">
     <w:nsid w:val="66BC006B"/>
     <w:multiLevelType w:val="multilevel"/>
     <w:tmpl w:val="89D2BAAC"/>
@@ -375,7 +2218,138 @@
       </w:rPr>
     </w:lvl>
   </w:abstractNum>
+  <w:abstractNum w:abstractNumId="6" w15:restartNumberingAfterBreak="0">
+    <w:nsid w:val="79CE186E"/>
+    <w:multiLevelType w:val="hybridMultilevel"/>
+    <w:tmpl w:val="1A5215AE"/>
+    <w:lvl w:ilvl="0" w:tplc="04090001">
+      <w:start w:val="1"/>
+      <w:numFmt w:val="bullet"/>
+      <w:lvlText w:val=""/>
+      <w:lvlJc w:val="left"/>
+      <w:pPr>
+        <w:ind w:left="720" w:hanging="360"/>
+      </w:pPr>
+      <w:rPr>
+        <w:rFonts w:ascii="Symbol" w:hAnsi="Symbol" w:hint="default"/>
+      </w:rPr>
+    </w:lvl>
+    <w:lvl w:ilvl="1" w:tplc="04090003">
+      <w:start w:val="1"/>
+      <w:numFmt w:val="bullet"/>
+      <w:lvlText w:val="o"/>
+      <w:lvlJc w:val="left"/>
+      <w:pPr>
+        <w:ind w:left="1440" w:hanging="360"/>
+      </w:pPr>
+      <w:rPr>
+        <w:rFonts w:ascii="Courier New" w:hAnsi="Courier New" w:cs="Courier New" w:hint="default"/>
+      </w:rPr>
+    </w:lvl>
+    <w:lvl w:ilvl="2" w:tplc="04090005" w:tentative="1">
+      <w:start w:val="1"/>
+      <w:numFmt w:val="bullet"/>
+      <w:lvlText w:val=""/>
+      <w:lvlJc w:val="left"/>
+      <w:pPr>
+        <w:ind w:left="2160" w:hanging="360"/>
+      </w:pPr>
+      <w:rPr>
+        <w:rFonts w:ascii="Wingdings" w:hAnsi="Wingdings" w:hint="default"/>
+      </w:rPr>
+    </w:lvl>
+    <w:lvl w:ilvl="3" w:tplc="04090001" w:tentative="1">
+      <w:start w:val="1"/>
+      <w:numFmt w:val="bullet"/>
+      <w:lvlText w:val=""/>
+      <w:lvlJc w:val="left"/>
+      <w:pPr>
+        <w:ind w:left="2880" w:hanging="360"/>
+      </w:pPr>
+      <w:rPr>
+        <w:rFonts w:ascii="Symbol" w:hAnsi="Symbol" w:hint="default"/>
+      </w:rPr>
+    </w:lvl>
+    <w:lvl w:ilvl="4" w:tplc="04090003" w:tentative="1">
+      <w:start w:val="1"/>
+      <w:numFmt w:val="bullet"/>
+      <w:lvlText w:val="o"/>
+      <w:lvlJc w:val="left"/>
+      <w:pPr>
+        <w:ind w:left="3600" w:hanging="360"/>
+      </w:pPr>
+      <w:rPr>
+        <w:rFonts w:ascii="Courier New" w:hAnsi="Courier New" w:cs="Courier New" w:hint="default"/>
+      </w:rPr>
+    </w:lvl>
+    <w:lvl w:ilvl="5" w:tplc="04090005" w:tentative="1">
+      <w:start w:val="1"/>
+      <w:numFmt w:val="bullet"/>
+      <w:lvlText w:val=""/>
+      <w:lvlJc w:val="left"/>
+      <w:pPr>
+        <w:ind w:left="4320" w:hanging="360"/>
+      </w:pPr>
+      <w:rPr>
+        <w:rFonts w:ascii="Wingdings" w:hAnsi="Wingdings" w:hint="default"/>
+      </w:rPr>
+    </w:lvl>
+    <w:lvl w:ilvl="6" w:tplc="04090001" w:tentative="1">
+      <w:start w:val="1"/>
+      <w:numFmt w:val="bullet"/>
+      <w:lvlText w:val=""/>
+      <w:lvlJc w:val="left"/>
+      <w:pPr>
+        <w:ind w:left="5040" w:hanging="360"/>
+      </w:pPr>
+      <w:rPr>
+        <w:rFonts w:ascii="Symbol" w:hAnsi="Symbol" w:hint="default"/>
+      </w:rPr>
+    </w:lvl>
+    <w:lvl w:ilvl="7" w:tplc="04090003" w:tentative="1">
+      <w:start w:val="1"/>
+      <w:numFmt w:val="bullet"/>
+      <w:lvlText w:val="o"/>
+      <w:lvlJc w:val="left"/>
+      <w:pPr>
+        <w:ind w:left="5760" w:hanging="360"/>
+      </w:pPr>
+      <w:rPr>
+        <w:rFonts w:ascii="Courier New" w:hAnsi="Courier New" w:cs="Courier New" w:hint="default"/>
+      </w:rPr>
+    </w:lvl>
+    <w:lvl w:ilvl="8" w:tplc="04090005" w:tentative="1">
+      <w:start w:val="1"/>
+      <w:numFmt w:val="bullet"/>
+      <w:lvlText w:val=""/>
+      <w:lvlJc w:val="left"/>
+      <w:pPr>
+        <w:ind w:left="6480" w:hanging="360"/>
+      </w:pPr>
+      <w:rPr>
+        <w:rFonts w:ascii="Wingdings" w:hAnsi="Wingdings" w:hint="default"/>
+      </w:rPr>
+    </w:lvl>
+  </w:abstractNum>
   <w:num w:numId="1" w16cid:durableId="1421218679">
+    <w:abstractNumId w:val="5"/>
+  </w:num>
+  <w:num w:numId="2" w16cid:durableId="1665742490">
+    <w:abstractNumId w:val="4"/>
+  </w:num>
+  <w:num w:numId="3" w16cid:durableId="820318511">
+    <w:abstractNumId w:val="6"/>
+  </w:num>
+  <w:num w:numId="4" w16cid:durableId="491289210">
+    <w:abstractNumId w:val="3"/>
+  </w:num>
+  <w:num w:numId="5" w16cid:durableId="1594584825">
+    <w:abstractNumId w:val="2"/>
+  </w:num>
+  <w:num w:numId="6" w16cid:durableId="598753073">
+    <w:abstractNumId w:val="1"/>
+  </w:num>
+  <w:num w:numId="7" w16cid:durableId="271980993">
     <w:abstractNumId w:val="0"/>
   </w:num>
 </w:numbering>
@@ -779,6 +2753,7 @@
   <w:style w:type="paragraph" w:default="1" w:styleId="Normal">
     <w:name w:val="Normal"/>
     <w:qFormat/>
+    <w:rsid w:val="0036289E"/>
   </w:style>
   <w:style w:type="paragraph" w:styleId="Heading1">
     <w:name w:val="heading 1"/>
@@ -896,7 +2871,6 @@
   <w:style w:type="character" w:default="1" w:styleId="DefaultParagraphFont">
     <w:name w:val="Default Paragraph Font"/>
     <w:uiPriority w:val="1"/>
-    <w:semiHidden/>
     <w:unhideWhenUsed/>
   </w:style>
   <w:style w:type="table" w:default="1" w:styleId="TableNormal">
@@ -952,6 +2926,59 @@
       <w:sz w:val="30"/>
       <w:szCs w:val="30"/>
     </w:rPr>
+  </w:style>
+  <w:style w:type="paragraph" w:styleId="ListParagraph">
+    <w:name w:val="List Paragraph"/>
+    <w:basedOn w:val="Normal"/>
+    <w:uiPriority w:val="34"/>
+    <w:qFormat/>
+    <w:rsid w:val="00DE45BC"/>
+    <w:pPr>
+      <w:ind w:left="720"/>
+      <w:contextualSpacing/>
+    </w:pPr>
+  </w:style>
+  <w:style w:type="character" w:styleId="Hyperlink">
+    <w:name w:val="Hyperlink"/>
+    <w:basedOn w:val="DefaultParagraphFont"/>
+    <w:uiPriority w:val="99"/>
+    <w:unhideWhenUsed/>
+    <w:rsid w:val="00DB6151"/>
+    <w:rPr>
+      <w:color w:val="0000FF" w:themeColor="hyperlink"/>
+      <w:u w:val="single"/>
+    </w:rPr>
+  </w:style>
+  <w:style w:type="character" w:styleId="UnresolvedMention">
+    <w:name w:val="Unresolved Mention"/>
+    <w:basedOn w:val="DefaultParagraphFont"/>
+    <w:uiPriority w:val="99"/>
+    <w:semiHidden/>
+    <w:unhideWhenUsed/>
+    <w:rsid w:val="00DB6151"/>
+    <w:rPr>
+      <w:color w:val="605E5C"/>
+      <w:shd w:val="clear" w:color="auto" w:fill="E1DFDD"/>
+    </w:rPr>
+  </w:style>
+  <w:style w:type="table" w:styleId="TableGrid">
+    <w:name w:val="Table Grid"/>
+    <w:basedOn w:val="TableNormal"/>
+    <w:uiPriority w:val="39"/>
+    <w:rsid w:val="00087F4B"/>
+    <w:pPr>
+      <w:spacing w:line="240" w:lineRule="auto"/>
+    </w:pPr>
+    <w:tblPr>
+      <w:tblBorders>
+        <w:top w:val="single" w:sz="4" w:space="0" w:color="auto"/>
+        <w:left w:val="single" w:sz="4" w:space="0" w:color="auto"/>
+        <w:bottom w:val="single" w:sz="4" w:space="0" w:color="auto"/>
+        <w:right w:val="single" w:sz="4" w:space="0" w:color="auto"/>
+        <w:insideH w:val="single" w:sz="4" w:space="0" w:color="auto"/>
+        <w:insideV w:val="single" w:sz="4" w:space="0" w:color="auto"/>
+      </w:tblBorders>
+    </w:tblPr>
   </w:style>
 </w:styles>
 </file>

</xml_diff>

<commit_message>
created bill of materials
</commit_message>
<xml_diff>
--- a/E-Bike Data Logger Documentation.docx
+++ b/E-Bike Data Logger Documentation.docx
@@ -15,7 +15,15 @@
         <w:jc w:val="center"/>
       </w:pPr>
       <w:r>
-        <w:t>For Thalchemy and the Bureau of Land Management</w:t>
+        <w:t xml:space="preserve">For </w:t>
+      </w:r>
+      <w:proofErr w:type="spellStart"/>
+      <w:r>
+        <w:t>Thalchemy</w:t>
+      </w:r>
+      <w:proofErr w:type="spellEnd"/>
+      <w:r>
+        <w:t xml:space="preserve"> and the Bureau of Land Management</w:t>
       </w:r>
     </w:p>
     <w:p>
@@ -48,10 +56,7 @@
         </w:numPr>
       </w:pPr>
       <w:r>
-        <w:t xml:space="preserve"> </w:t>
-      </w:r>
-      <w:r>
-        <w:t>Deployment</w:t>
+        <w:t xml:space="preserve"> Deployment</w:t>
       </w:r>
     </w:p>
     <w:p>
@@ -216,7 +221,14 @@
     <w:p>
       <w:r>
         <w:tab/>
-        <w:t xml:space="preserve">In order to deploy a sensor array and be able to collect the most high-fidelity data, the following instructions must be followed. </w:t>
+      </w:r>
+      <w:proofErr w:type="gramStart"/>
+      <w:r>
+        <w:t>In order to</w:t>
+      </w:r>
+      <w:proofErr w:type="gramEnd"/>
+      <w:r>
+        <w:t xml:space="preserve"> deploy a sensor array and be able to collect the most high-fidelity data, the following instructions must be followed. </w:t>
       </w:r>
     </w:p>
     <w:p>
@@ -293,7 +305,15 @@
         </w:numPr>
       </w:pPr>
       <w:r>
-        <w:t>The battery box must be just off of the trail, obscured from view by a bush, rocks or other natural items that blend in with the landscape</w:t>
+        <w:t xml:space="preserve">The battery box must be just </w:t>
+      </w:r>
+      <w:proofErr w:type="gramStart"/>
+      <w:r>
+        <w:t>off of</w:t>
+      </w:r>
+      <w:proofErr w:type="gramEnd"/>
+      <w:r>
+        <w:t xml:space="preserve"> the trail, obscured from view by a bush, rocks or other natural items that blend in with the landscape</w:t>
       </w:r>
     </w:p>
     <w:p>
@@ -349,7 +369,15 @@
     </w:p>
     <w:p>
       <w:r>
-        <w:t>The User Interface (UI) is the application that will be used to access and collect data collected by the microcontroller. This application is only runnable on windows machines, but should not require any other dependencies or installations.</w:t>
+        <w:t xml:space="preserve">The User Interface (UI) is the application that will be used to access and collect data collected by the microcontroller. This application is only runnable on </w:t>
+      </w:r>
+      <w:proofErr w:type="gramStart"/>
+      <w:r>
+        <w:t>windows machines, but</w:t>
+      </w:r>
+      <w:proofErr w:type="gramEnd"/>
+      <w:r>
+        <w:t xml:space="preserve"> should not require any other dependencies or installations.</w:t>
       </w:r>
     </w:p>
     <w:p>
@@ -369,11 +397,33 @@
         <w:t xml:space="preserve">Navigate to </w:t>
       </w:r>
       <w:hyperlink r:id="rId5" w:history="1">
+        <w:proofErr w:type="spellStart"/>
         <w:r>
           <w:rPr>
             <w:rStyle w:val="Hyperlink"/>
           </w:rPr>
-          <w:t>zanderalbaz/EBike-Data-Logger</w:t>
+          <w:t>zanderalbaz</w:t>
+        </w:r>
+        <w:proofErr w:type="spellEnd"/>
+        <w:r>
+          <w:rPr>
+            <w:rStyle w:val="Hyperlink"/>
+          </w:rPr>
+          <w:t>/</w:t>
+        </w:r>
+        <w:proofErr w:type="spellStart"/>
+        <w:r>
+          <w:rPr>
+            <w:rStyle w:val="Hyperlink"/>
+          </w:rPr>
+          <w:t>EBike</w:t>
+        </w:r>
+        <w:proofErr w:type="spellEnd"/>
+        <w:r>
+          <w:rPr>
+            <w:rStyle w:val="Hyperlink"/>
+          </w:rPr>
+          <w:t>-Data-Logger</w:t>
         </w:r>
       </w:hyperlink>
     </w:p>
@@ -593,7 +643,15 @@
     </w:p>
     <w:p>
       <w:r>
-        <w:t>Collection of bike signatures will happen automatically, but in order to have access to this data, the following step</w:t>
+        <w:t xml:space="preserve">Collection of bike signatures will happen automatically, but </w:t>
+      </w:r>
+      <w:proofErr w:type="gramStart"/>
+      <w:r>
+        <w:t>in order to</w:t>
+      </w:r>
+      <w:proofErr w:type="gramEnd"/>
+      <w:r>
+        <w:t xml:space="preserve"> have access to this data, the following step</w:t>
       </w:r>
       <w:r>
         <w:t>s</w:t>
@@ -883,54 +941,263 @@
     </w:p>
     <w:p>
       <w:r>
+        <w:t xml:space="preserve">If your PC crashes while trying to launch the app: </w:t>
+      </w:r>
+    </w:p>
+    <w:p>
+      <w:pPr>
+        <w:pStyle w:val="ListParagraph"/>
+        <w:numPr>
+          <w:ilvl w:val="0"/>
+          <w:numId w:val="9"/>
+        </w:numPr>
+      </w:pPr>
+      <w:r>
+        <w:t>Ensure that your device is fully charged before collecting data</w:t>
+      </w:r>
+    </w:p>
+    <w:p>
+      <w:pPr>
+        <w:pStyle w:val="ListParagraph"/>
+        <w:numPr>
+          <w:ilvl w:val="0"/>
+          <w:numId w:val="9"/>
+        </w:numPr>
+      </w:pPr>
+      <w:r>
+        <w:t>Switch</w:t>
+      </w:r>
+      <w:r>
+        <w:t xml:space="preserve"> to a </w:t>
+      </w:r>
+      <w:r>
+        <w:t>windows machine</w:t>
+      </w:r>
+      <w:r>
+        <w:t xml:space="preserve"> with </w:t>
+      </w:r>
+      <w:r>
+        <w:t>at least 16 GB of RAM, and a sufficient processor</w:t>
+      </w:r>
+    </w:p>
+    <w:p>
+      <w:pPr>
+        <w:pStyle w:val="ListParagraph"/>
+        <w:numPr>
+          <w:ilvl w:val="1"/>
+          <w:numId w:val="9"/>
+        </w:numPr>
+      </w:pPr>
+      <w:r>
+        <w:t xml:space="preserve">The </w:t>
+      </w:r>
+      <w:r>
+        <w:t>application</w:t>
+      </w:r>
+      <w:r>
+        <w:t xml:space="preserve"> has no issues with a 12</w:t>
+      </w:r>
+      <w:r>
+        <w:rPr>
+          <w:vertAlign w:val="superscript"/>
+        </w:rPr>
+        <w:t>th</w:t>
+      </w:r>
+      <w:r>
+        <w:t xml:space="preserve"> Gen Intel</w:t>
+      </w:r>
+      <w:r>
+        <w:t>®</w:t>
+      </w:r>
+      <w:r>
+        <w:t xml:space="preserve"> Core™ i7-1255U processor, 1.70 GHz, 10 cores, 12 logical processors</w:t>
+      </w:r>
+    </w:p>
+    <w:p/>
+    <w:p>
+      <w:r>
         <w:t>If pins become unplugged:</w:t>
       </w:r>
-    </w:p>
-    <w:p>
-      <w:r>
-        <w:t>If connection not successful:</w:t>
-      </w:r>
-    </w:p>
-    <w:p>
-      <w:r>
-        <w:t>If transfer not successful:</w:t>
+      <w:r>
+        <w:t xml:space="preserve"> </w:t>
+      </w:r>
+    </w:p>
+    <w:p>
+      <w:pPr>
+        <w:pStyle w:val="ListParagraph"/>
+        <w:numPr>
+          <w:ilvl w:val="0"/>
+          <w:numId w:val="10"/>
+        </w:numPr>
+      </w:pPr>
+      <w:r>
+        <w:lastRenderedPageBreak/>
+        <w:t xml:space="preserve">The only pins that </w:t>
+      </w:r>
+      <w:r>
+        <w:t>are likely to</w:t>
+      </w:r>
+      <w:r>
+        <w:t xml:space="preserve"> become unplugged are the two 3V3 pins. They </w:t>
+      </w:r>
+      <w:proofErr w:type="gramStart"/>
+      <w:r>
+        <w:t>belong</w:t>
+      </w:r>
+      <w:proofErr w:type="gramEnd"/>
+      <w:r>
+        <w:t xml:space="preserve"> in the small green box next to the microcontroller. Insert the dislodged pin into the slot in the green box. Use the </w:t>
+      </w:r>
+      <w:r>
+        <w:t>screwdriver</w:t>
+      </w:r>
+      <w:r>
+        <w:t xml:space="preserve"> included in the black box to tighten down the screw until you cannot remove the pin by pulling on it</w:t>
+      </w:r>
+    </w:p>
+    <w:p>
+      <w:pPr>
+        <w:pStyle w:val="ListParagraph"/>
+        <w:numPr>
+          <w:ilvl w:val="0"/>
+          <w:numId w:val="10"/>
+        </w:numPr>
+      </w:pPr>
+      <w:r>
+        <w:t xml:space="preserve">If any other pins become dislodged, they will need to be soldered back in place. </w:t>
+      </w:r>
+      <w:r>
+        <w:t xml:space="preserve">Take the sensor array out of commission and make the necessary repairs. </w:t>
+      </w:r>
+      <w:r>
+        <w:t>See the wiring diagram (section 2.2) for reference</w:t>
       </w:r>
     </w:p>
     <w:p/>
     <w:p>
-      <w:pPr>
-        <w:rPr>
-          <w:sz w:val="26"/>
-          <w:szCs w:val="26"/>
-        </w:rPr>
-      </w:pPr>
-      <w:r>
-        <w:rPr>
-          <w:sz w:val="26"/>
-          <w:szCs w:val="26"/>
-        </w:rPr>
-        <w:t xml:space="preserve">Section </w:t>
-      </w:r>
-      <w:r>
-        <w:rPr>
-          <w:sz w:val="26"/>
-          <w:szCs w:val="26"/>
-        </w:rPr>
-        <w:t>2</w:t>
-      </w:r>
-      <w:r>
-        <w:rPr>
-          <w:sz w:val="26"/>
-          <w:szCs w:val="26"/>
-        </w:rPr>
-        <w:t xml:space="preserve">: </w:t>
-      </w:r>
-      <w:r>
-        <w:rPr>
-          <w:sz w:val="26"/>
-          <w:szCs w:val="26"/>
-        </w:rPr>
-        <w:t>Hardware</w:t>
+      <w:r>
+        <w:t xml:space="preserve">If connection </w:t>
+      </w:r>
+      <w:proofErr w:type="gramStart"/>
+      <w:r>
+        <w:t>not</w:t>
+      </w:r>
+      <w:proofErr w:type="gramEnd"/>
+      <w:r>
+        <w:t xml:space="preserve"> successful:</w:t>
+      </w:r>
+      <w:r>
+        <w:t xml:space="preserve"> </w:t>
+      </w:r>
+    </w:p>
+    <w:p>
+      <w:pPr>
+        <w:pStyle w:val="ListParagraph"/>
+        <w:numPr>
+          <w:ilvl w:val="0"/>
+          <w:numId w:val="11"/>
+        </w:numPr>
+      </w:pPr>
+      <w:r>
+        <w:t>Ensure that Bluetooth is disabled on your device</w:t>
+      </w:r>
+    </w:p>
+    <w:p>
+      <w:pPr>
+        <w:pStyle w:val="ListParagraph"/>
+        <w:numPr>
+          <w:ilvl w:val="0"/>
+          <w:numId w:val="11"/>
+        </w:numPr>
+      </w:pPr>
+      <w:r>
+        <w:t>D</w:t>
+      </w:r>
+      <w:r>
+        <w:t>isconnect any other USB cables from your computer</w:t>
+      </w:r>
+    </w:p>
+    <w:p>
+      <w:pPr>
+        <w:pStyle w:val="ListParagraph"/>
+        <w:numPr>
+          <w:ilvl w:val="0"/>
+          <w:numId w:val="11"/>
+        </w:numPr>
+      </w:pPr>
+      <w:r>
+        <w:t>C</w:t>
+      </w:r>
+      <w:r>
+        <w:t xml:space="preserve">lose the app and disconnect the data cable from the USB port on your computer, </w:t>
+      </w:r>
+      <w:r>
+        <w:t>then</w:t>
+      </w:r>
+      <w:r>
+        <w:t xml:space="preserve"> plug the cable back in and re-launch the app</w:t>
+      </w:r>
+    </w:p>
+    <w:p/>
+    <w:p>
+      <w:r>
+        <w:t xml:space="preserve">If transfer </w:t>
+      </w:r>
+      <w:proofErr w:type="gramStart"/>
+      <w:r>
+        <w:t>not</w:t>
+      </w:r>
+      <w:proofErr w:type="gramEnd"/>
+      <w:r>
+        <w:t xml:space="preserve"> successful:</w:t>
+      </w:r>
+      <w:r>
+        <w:t xml:space="preserve"> </w:t>
+      </w:r>
+    </w:p>
+    <w:p>
+      <w:pPr>
+        <w:pStyle w:val="ListParagraph"/>
+        <w:numPr>
+          <w:ilvl w:val="0"/>
+          <w:numId w:val="12"/>
+        </w:numPr>
+      </w:pPr>
+      <w:r>
+        <w:t>C</w:t>
+      </w:r>
+      <w:r>
+        <w:t xml:space="preserve">lose the app and disconnect the data cable from the USB port on your computer, </w:t>
+      </w:r>
+      <w:proofErr w:type="gramStart"/>
+      <w:r>
+        <w:t>then,</w:t>
+      </w:r>
+      <w:proofErr w:type="gramEnd"/>
+      <w:r>
+        <w:t xml:space="preserve"> plug the cable back in and re-launch the app. The data will not be deleted from the SD card until it is safely downloaded on your computer. To double-check </w:t>
+      </w:r>
+      <w:r>
+        <w:t>the success</w:t>
+      </w:r>
+      <w:r>
+        <w:t xml:space="preserve"> of transfer, look for your new file in the view window.</w:t>
+      </w:r>
+    </w:p>
+    <w:p/>
+    <w:p>
+      <w:pPr>
+        <w:rPr>
+          <w:sz w:val="26"/>
+          <w:szCs w:val="26"/>
+        </w:rPr>
+      </w:pPr>
+      <w:r>
+        <w:rPr>
+          <w:sz w:val="26"/>
+          <w:szCs w:val="26"/>
+        </w:rPr>
+        <w:t>Section 2: Hardware</w:t>
       </w:r>
       <w:r>
         <w:rPr>
@@ -967,35 +1234,7 @@
           <w:szCs w:val="26"/>
         </w:rPr>
         <w:tab/>
-        <w:t xml:space="preserve">        2</w:t>
-      </w:r>
-      <w:r>
-        <w:rPr>
-          <w:sz w:val="26"/>
-          <w:szCs w:val="26"/>
-        </w:rPr>
-        <w:t>.</w:t>
-      </w:r>
-      <w:r>
-        <w:rPr>
-          <w:sz w:val="26"/>
-          <w:szCs w:val="26"/>
-        </w:rPr>
-        <w:t>1</w:t>
-      </w:r>
-      <w:r>
-        <w:rPr>
-          <w:sz w:val="26"/>
-          <w:szCs w:val="26"/>
-        </w:rPr>
-        <w:t xml:space="preserve"> </w:t>
-      </w:r>
-      <w:r>
-        <w:rPr>
-          <w:sz w:val="26"/>
-          <w:szCs w:val="26"/>
-        </w:rPr>
-        <w:t>Materials and Sources</w:t>
+        <w:t xml:space="preserve">        2.1 Materials and Sources</w:t>
       </w:r>
     </w:p>
     <w:p>
@@ -1111,7 +1350,6 @@
           </w:tcPr>
           <w:p>
             <w:r>
-              <w:lastRenderedPageBreak/>
               <w:t>Sensors</w:t>
             </w:r>
           </w:p>
@@ -1131,12 +1369,14 @@
             <w:tcW w:w="3203" w:type="dxa"/>
           </w:tcPr>
           <w:p>
+            <w:proofErr w:type="spellStart"/>
             <w:r>
               <w:t>S</w:t>
             </w:r>
             <w:r>
               <w:t>parkFun</w:t>
             </w:r>
+            <w:proofErr w:type="spellEnd"/>
           </w:p>
         </w:tc>
       </w:tr>
@@ -1256,64 +1496,126 @@
           <w:sz w:val="26"/>
           <w:szCs w:val="26"/>
         </w:rPr>
-        <w:t>2.</w:t>
-      </w:r>
-      <w:r>
-        <w:rPr>
-          <w:sz w:val="26"/>
-          <w:szCs w:val="26"/>
-        </w:rPr>
-        <w:t>2 Schematics</w:t>
+        <w:t>2.2 Schematics</w:t>
       </w:r>
     </w:p>
     <w:p/>
-    <w:p/>
-    <w:p>
-      <w:pPr>
-        <w:rPr>
-          <w:sz w:val="26"/>
-          <w:szCs w:val="26"/>
-        </w:rPr>
-      </w:pPr>
-      <w:r>
-        <w:rPr>
-          <w:sz w:val="26"/>
-          <w:szCs w:val="26"/>
-        </w:rPr>
-        <w:t xml:space="preserve">Section </w:t>
-      </w:r>
-      <w:r>
-        <w:rPr>
-          <w:sz w:val="26"/>
-          <w:szCs w:val="26"/>
-        </w:rPr>
-        <w:t>3</w:t>
-      </w:r>
-      <w:r>
-        <w:rPr>
-          <w:sz w:val="26"/>
-          <w:szCs w:val="26"/>
-        </w:rPr>
+    <w:p>
+      <w:r>
+        <w:rPr>
+          <w:noProof/>
+        </w:rPr>
+        <w:lastRenderedPageBreak/>
+        <w:drawing>
+          <wp:inline distT="0" distB="0" distL="0" distR="0" wp14:anchorId="7B060E40" wp14:editId="4B0B746B">
+            <wp:extent cx="5074920" cy="3985260"/>
+            <wp:effectExtent l="0" t="0" r="0" b="0"/>
+            <wp:docPr id="225581351" name="Picture 1" descr="A circuit board with many colored wires&#10;&#10;AI-generated content may be incorrect."/>
+            <wp:cNvGraphicFramePr>
+              <a:graphicFrameLocks xmlns:a="http://schemas.openxmlformats.org/drawingml/2006/main" noChangeAspect="1"/>
+            </wp:cNvGraphicFramePr>
+            <a:graphic xmlns:a="http://schemas.openxmlformats.org/drawingml/2006/main">
+              <a:graphicData uri="http://schemas.openxmlformats.org/drawingml/2006/picture">
+                <pic:pic xmlns:pic="http://schemas.openxmlformats.org/drawingml/2006/picture">
+                  <pic:nvPicPr>
+                    <pic:cNvPr id="225581351" name="Picture 1" descr="A circuit board with many colored wires&#10;&#10;AI-generated content may be incorrect."/>
+                    <pic:cNvPicPr/>
+                  </pic:nvPicPr>
+                  <pic:blipFill rotWithShape="1">
+                    <a:blip r:embed="rId6" cstate="print">
+                      <a:extLst>
+                        <a:ext uri="{28A0092B-C50C-407E-A947-70E740481C1C}">
+                          <a14:useLocalDpi xmlns:a14="http://schemas.microsoft.com/office/drawing/2010/main" val="0"/>
+                        </a:ext>
+                      </a:extLst>
+                    </a:blip>
+                    <a:srcRect l="6153" t="10518" r="8462" b="7378"/>
+                    <a:stretch/>
+                  </pic:blipFill>
+                  <pic:spPr bwMode="auto">
+                    <a:xfrm>
+                      <a:off x="0" y="0"/>
+                      <a:ext cx="5074920" cy="3985260"/>
+                    </a:xfrm>
+                    <a:prstGeom prst="rect">
+                      <a:avLst/>
+                    </a:prstGeom>
+                    <a:ln>
+                      <a:noFill/>
+                    </a:ln>
+                    <a:extLst>
+                      <a:ext uri="{53640926-AAD7-44D8-BBD7-CCE9431645EC}">
+                        <a14:shadowObscured xmlns:a14="http://schemas.microsoft.com/office/drawing/2010/main"/>
+                      </a:ext>
+                    </a:extLst>
+                  </pic:spPr>
+                </pic:pic>
+              </a:graphicData>
+            </a:graphic>
+          </wp:inline>
+        </w:drawing>
+      </w:r>
+    </w:p>
+    <w:p>
+      <w:pPr>
+        <w:rPr>
+          <w:sz w:val="26"/>
+          <w:szCs w:val="26"/>
+        </w:rPr>
+      </w:pPr>
+      <w:r>
+        <w:rPr>
+          <w:sz w:val="26"/>
+          <w:szCs w:val="26"/>
+        </w:rPr>
+        <w:t>Section 3: Software</w:t>
+      </w:r>
+    </w:p>
+    <w:p>
+      <w:proofErr w:type="gramStart"/>
+      <w:r>
+        <w:t>All of</w:t>
+      </w:r>
+      <w:proofErr w:type="gramEnd"/>
+      <w:r>
+        <w:t xml:space="preserve"> the software is accessible through the </w:t>
+      </w:r>
+      <w:proofErr w:type="spellStart"/>
+      <w:r>
+        <w:t>github</w:t>
+      </w:r>
+      <w:proofErr w:type="spellEnd"/>
+      <w:r>
         <w:t xml:space="preserve">: </w:t>
       </w:r>
-      <w:r>
-        <w:rPr>
-          <w:sz w:val="26"/>
-          <w:szCs w:val="26"/>
-        </w:rPr>
-        <w:t>Software</w:t>
-      </w:r>
-    </w:p>
-    <w:p>
-      <w:r>
-        <w:t xml:space="preserve">All of the software is accessible through the github: </w:t>
-      </w:r>
-      <w:hyperlink r:id="rId6" w:history="1">
+      <w:hyperlink r:id="rId7" w:history="1">
+        <w:proofErr w:type="spellStart"/>
         <w:r>
           <w:rPr>
             <w:rStyle w:val="Hyperlink"/>
           </w:rPr>
-          <w:t>zanderalbaz/EBike-Data-Logger</w:t>
+          <w:t>zanderalbaz</w:t>
+        </w:r>
+        <w:proofErr w:type="spellEnd"/>
+        <w:r>
+          <w:rPr>
+            <w:rStyle w:val="Hyperlink"/>
+          </w:rPr>
+          <w:t>/</w:t>
+        </w:r>
+        <w:proofErr w:type="spellStart"/>
+        <w:r>
+          <w:rPr>
+            <w:rStyle w:val="Hyperlink"/>
+          </w:rPr>
+          <w:t>EBike</w:t>
+        </w:r>
+        <w:proofErr w:type="spellEnd"/>
+        <w:r>
+          <w:rPr>
+            <w:rStyle w:val="Hyperlink"/>
+          </w:rPr>
+          <w:t>-Data-Logger</w:t>
         </w:r>
       </w:hyperlink>
     </w:p>
@@ -1395,52 +1697,39 @@
           <w:szCs w:val="26"/>
         </w:rPr>
         <w:tab/>
-        <w:t xml:space="preserve"> </w:t>
-      </w:r>
-      <w:r>
-        <w:rPr>
-          <w:sz w:val="26"/>
-          <w:szCs w:val="26"/>
-        </w:rPr>
-        <w:t xml:space="preserve"> </w:t>
-      </w:r>
-      <w:r>
-        <w:rPr>
-          <w:sz w:val="26"/>
-          <w:szCs w:val="26"/>
-        </w:rPr>
-        <w:t>3</w:t>
-      </w:r>
-      <w:r>
-        <w:rPr>
-          <w:sz w:val="26"/>
-          <w:szCs w:val="26"/>
-        </w:rPr>
-        <w:t xml:space="preserve">.1 </w:t>
-      </w:r>
-      <w:r>
-        <w:rPr>
-          <w:sz w:val="26"/>
-          <w:szCs w:val="26"/>
-        </w:rPr>
-        <w:t>Desktop Application</w:t>
-      </w:r>
-    </w:p>
-    <w:p>
-      <w:r>
-        <w:t>The desktop application was created in Java using the Intellij IDE on a Windows machine</w:t>
-      </w:r>
-      <w:r>
-        <w:t xml:space="preserve"> with Oracle OpenJDK 23.0.1 with a language level 17. It requires jSerialComm-2.11.0.jar. </w:t>
-      </w:r>
-      <w:r>
-        <w:t xml:space="preserve">The </w:t>
-      </w:r>
-      <w:r>
-        <w:t xml:space="preserve">source </w:t>
-      </w:r>
-      <w:r>
-        <w:t>code was compiled into an executable using jPackage.</w:t>
+        <w:t xml:space="preserve">  3.1 Desktop Application</w:t>
+      </w:r>
+    </w:p>
+    <w:p>
+      <w:r>
+        <w:t xml:space="preserve">The desktop application was created in Java using the </w:t>
+      </w:r>
+      <w:proofErr w:type="spellStart"/>
+      <w:r>
+        <w:t>Intellij</w:t>
+      </w:r>
+      <w:proofErr w:type="spellEnd"/>
+      <w:r>
+        <w:t xml:space="preserve"> IDE on a Windows machine</w:t>
+      </w:r>
+      <w:r>
+        <w:t xml:space="preserve"> with Oracle OpenJDK 23.0.1 with </w:t>
+      </w:r>
+      <w:proofErr w:type="gramStart"/>
+      <w:r>
+        <w:t>a language</w:t>
+      </w:r>
+      <w:proofErr w:type="gramEnd"/>
+      <w:r>
+        <w:t xml:space="preserve"> level 17. It requires jSerialComm-2.11.0.jar. The source code was compiled into an executable using </w:t>
+      </w:r>
+      <w:proofErr w:type="spellStart"/>
+      <w:r>
+        <w:t>jPackage</w:t>
+      </w:r>
+      <w:proofErr w:type="spellEnd"/>
+      <w:r>
+        <w:t>.</w:t>
       </w:r>
     </w:p>
     <w:p>
@@ -1464,33 +1753,28 @@
           <w:sz w:val="26"/>
           <w:szCs w:val="26"/>
         </w:rPr>
-        <w:t>3.</w:t>
-      </w:r>
-      <w:r>
-        <w:rPr>
-          <w:sz w:val="26"/>
-          <w:szCs w:val="26"/>
-        </w:rPr>
-        <w:t>2</w:t>
-      </w:r>
-      <w:r>
-        <w:rPr>
-          <w:sz w:val="26"/>
-          <w:szCs w:val="26"/>
-        </w:rPr>
-        <w:t xml:space="preserve"> </w:t>
-      </w:r>
-      <w:r>
-        <w:rPr>
-          <w:sz w:val="26"/>
-          <w:szCs w:val="26"/>
-        </w:rPr>
-        <w:t>Microcontroller Code</w:t>
-      </w:r>
-    </w:p>
-    <w:p>
-      <w:r>
-        <w:t>The code for the ESP32 was coded in C++ and created in the Arduino IDE version 1.8.12. Libraries: Adafruit BusIO, Adafruit MLX90393, SparkFun 9DoF IMU Breakout – ICM 20948 – Arduino Library</w:t>
+        <w:t>3.2 Microcontroller Code</w:t>
+      </w:r>
+    </w:p>
+    <w:p>
+      <w:r>
+        <w:t xml:space="preserve">The code for the ESP32 was coded in C++ and created in the Arduino IDE version 1.8.12. Libraries: Adafruit </w:t>
+      </w:r>
+      <w:proofErr w:type="spellStart"/>
+      <w:r>
+        <w:t>BusIO</w:t>
+      </w:r>
+      <w:proofErr w:type="spellEnd"/>
+      <w:r>
+        <w:t xml:space="preserve">, Adafruit MLX90393, </w:t>
+      </w:r>
+      <w:proofErr w:type="spellStart"/>
+      <w:r>
+        <w:t>SparkFun</w:t>
+      </w:r>
+      <w:proofErr w:type="spellEnd"/>
+      <w:r>
+        <w:t xml:space="preserve"> 9DoF IMU Breakout – ICM 20948 – Arduino Library</w:t>
       </w:r>
       <w:r>
         <w:t xml:space="preserve">, Adafruit Unified Sensor in addition to the Built-in libraries. </w:t>
@@ -1515,17 +1799,190 @@
     </w:p>
     <w:p>
       <w:r>
-        <w:t>The machine learning and preprocessing algorithms were scripted and trained in python using Jupyter Notebook, where they were ported to a .json file that we then included as a header in the microcontroller code.</w:t>
-      </w:r>
-      <w:r>
-        <w:t xml:space="preserve"> The preprocessing algorithm takes in a 18x50 table (18 columns over 50 collections) and returns </w:t>
-      </w:r>
-      <w:r>
-        <w:t xml:space="preserve">summary satistics. The summary satistics used are average, standard deviation and upper and lower quartile. This reduces it to a 18x4 table, which is then flattened into a single row (1x72) to pass to the algorithm. </w:t>
-      </w:r>
-      <w:r>
-        <w:t>The algorithm used is a XGBoost algorithm with the following parameters: XGBOOST PARAMETERS.</w:t>
-      </w:r>
+        <w:t xml:space="preserve">The machine learning and preprocessing algorithms were scripted and trained in python using </w:t>
+      </w:r>
+      <w:proofErr w:type="spellStart"/>
+      <w:r>
+        <w:t>Jupyter</w:t>
+      </w:r>
+      <w:proofErr w:type="spellEnd"/>
+      <w:r>
+        <w:t xml:space="preserve"> Notebook, where they were ported to a .</w:t>
+      </w:r>
+      <w:proofErr w:type="spellStart"/>
+      <w:r>
+        <w:t>json</w:t>
+      </w:r>
+      <w:proofErr w:type="spellEnd"/>
+      <w:r>
+        <w:t xml:space="preserve"> file that we then included as a header in the microcontroller code.</w:t>
+      </w:r>
+      <w:r>
+        <w:t xml:space="preserve"> The preprocessing algorithm takes in </w:t>
+      </w:r>
+      <w:proofErr w:type="gramStart"/>
+      <w:r>
+        <w:t>a 18x50</w:t>
+      </w:r>
+      <w:proofErr w:type="gramEnd"/>
+      <w:r>
+        <w:t xml:space="preserve"> table (18 columns over 50 collections) and returns </w:t>
+      </w:r>
+      <w:r>
+        <w:t>summary s</w:t>
+      </w:r>
+      <w:r>
+        <w:t>t</w:t>
+      </w:r>
+      <w:r>
+        <w:t>atistics. The summary s</w:t>
+      </w:r>
+      <w:r>
+        <w:t>t</w:t>
+      </w:r>
+      <w:r>
+        <w:t xml:space="preserve">atistics used are average, standard deviation and upper and lower quartile. This reduces it to </w:t>
+      </w:r>
+      <w:proofErr w:type="gramStart"/>
+      <w:r>
+        <w:t>a 18x4</w:t>
+      </w:r>
+      <w:proofErr w:type="gramEnd"/>
+      <w:r>
+        <w:t xml:space="preserve"> table, which is then flattened into a single row (1x72) to pass to the algorithm. </w:t>
+      </w:r>
+      <w:r>
+        <w:t xml:space="preserve">The algorithm used is a </w:t>
+      </w:r>
+      <w:proofErr w:type="spellStart"/>
+      <w:r>
+        <w:t>XGBoost</w:t>
+      </w:r>
+      <w:proofErr w:type="spellEnd"/>
+      <w:r>
+        <w:t xml:space="preserve"> algorithm with the following parameters: XGBOOST PARAMETERS.</w:t>
+      </w:r>
+    </w:p>
+    <w:p/>
+    <w:p>
+      <w:pPr>
+        <w:jc w:val="right"/>
+        <w:rPr>
+          <w:sz w:val="26"/>
+          <w:szCs w:val="26"/>
+        </w:rPr>
+      </w:pPr>
+      <w:r>
+        <w:rPr>
+          <w:sz w:val="26"/>
+          <w:szCs w:val="26"/>
+        </w:rPr>
+        <w:lastRenderedPageBreak/>
+        <w:t xml:space="preserve">3.3 </w:t>
+      </w:r>
+      <w:r>
+        <w:rPr>
+          <w:sz w:val="26"/>
+          <w:szCs w:val="26"/>
+        </w:rPr>
+        <w:t>Further refinement of ML algorithm</w:t>
+      </w:r>
+    </w:p>
+    <w:p>
+      <w:r>
+        <w:t>To collect more data for the algorithm and tune it further, follow the steps must be followed.</w:t>
+      </w:r>
+    </w:p>
+    <w:p>
+      <w:pPr>
+        <w:pStyle w:val="ListParagraph"/>
+        <w:numPr>
+          <w:ilvl w:val="0"/>
+          <w:numId w:val="8"/>
+        </w:numPr>
+      </w:pPr>
+      <w:r>
+        <w:t>[CHANGE TO DATA COLLECTION MODE]</w:t>
+      </w:r>
+    </w:p>
+    <w:p>
+      <w:pPr>
+        <w:pStyle w:val="ListParagraph"/>
+        <w:numPr>
+          <w:ilvl w:val="0"/>
+          <w:numId w:val="8"/>
+        </w:numPr>
+      </w:pPr>
+      <w:r>
+        <w:t>[ENSURE DATA HAS CORRECT LABEL]</w:t>
+      </w:r>
+    </w:p>
+    <w:p>
+      <w:pPr>
+        <w:pStyle w:val="ListParagraph"/>
+        <w:numPr>
+          <w:ilvl w:val="0"/>
+          <w:numId w:val="8"/>
+        </w:numPr>
+      </w:pPr>
+      <w:r>
+        <w:t>Collect whatever data you need to</w:t>
+      </w:r>
+      <w:r>
+        <w:t>, changing the label as necessary</w:t>
+      </w:r>
+    </w:p>
+    <w:p>
+      <w:pPr>
+        <w:pStyle w:val="ListParagraph"/>
+        <w:numPr>
+          <w:ilvl w:val="0"/>
+          <w:numId w:val="8"/>
+        </w:numPr>
+      </w:pPr>
+      <w:r>
+        <w:t xml:space="preserve">Import the new dataset into the machine learning algorithm in </w:t>
+      </w:r>
+      <w:proofErr w:type="spellStart"/>
+      <w:r>
+        <w:t>Jupyter</w:t>
+      </w:r>
+      <w:proofErr w:type="spellEnd"/>
+      <w:r>
+        <w:t xml:space="preserve"> Notebook (</w:t>
+      </w:r>
+      <w:r>
+        <w:t xml:space="preserve">Bike classification </w:t>
+      </w:r>
+      <w:proofErr w:type="spellStart"/>
+      <w:r>
+        <w:t>Final.ipynb</w:t>
+      </w:r>
+      <w:proofErr w:type="spellEnd"/>
+      <w:r>
+        <w:t>)</w:t>
+      </w:r>
+    </w:p>
+    <w:p>
+      <w:pPr>
+        <w:pStyle w:val="ListParagraph"/>
+        <w:numPr>
+          <w:ilvl w:val="1"/>
+          <w:numId w:val="8"/>
+        </w:numPr>
+      </w:pPr>
+      <w:r>
+        <w:t>You can keep or discard previously collected data, just append to the data frame if you want to add new data</w:t>
+      </w:r>
+    </w:p>
+    <w:p>
+      <w:pPr>
+        <w:pStyle w:val="ListParagraph"/>
+        <w:numPr>
+          <w:ilvl w:val="0"/>
+          <w:numId w:val="8"/>
+        </w:numPr>
+      </w:pPr>
     </w:p>
     <w:p/>
     <w:sectPr>
@@ -1541,6 +1998,92 @@
 <file path=word/numbering.xml><?xml version="1.0" encoding="utf-8"?>
 <w:numbering xmlns:wpc="http://schemas.microsoft.com/office/word/2010/wordprocessingCanvas" xmlns:cx="http://schemas.microsoft.com/office/drawing/2014/chartex" xmlns:cx1="http://schemas.microsoft.com/office/drawing/2015/9/8/chartex" xmlns:cx2="http://schemas.microsoft.com/office/drawing/2015/10/21/chartex" xmlns:cx3="http://schemas.microsoft.com/office/drawing/2016/5/9/chartex" xmlns:cx4="http://schemas.microsoft.com/office/drawing/2016/5/10/chartex" xmlns:cx5="http://schemas.microsoft.com/office/drawing/2016/5/11/chartex" xmlns:cx6="http://schemas.microsoft.com/office/drawing/2016/5/12/chartex" xmlns:cx7="http://schemas.microsoft.com/office/drawing/2016/5/13/chartex" xmlns:cx8="http://schemas.microsoft.com/office/drawing/2016/5/14/chartex" xmlns:mc="http://schemas.openxmlformats.org/markup-compatibility/2006" xmlns:aink="http://schemas.microsoft.com/office/drawing/2016/ink" xmlns:am3d="http://schemas.microsoft.com/office/drawing/2017/model3d" xmlns:o="urn:schemas-microsoft-com:office:office" xmlns:oel="http://schemas.microsoft.com/office/2019/extlst" xmlns:r="http://schemas.openxmlformats.org/officeDocument/2006/relationships" xmlns:m="http://schemas.openxmlformats.org/officeDocument/2006/math" xmlns:v="urn:schemas-microsoft-com:vml" xmlns:wp14="http://schemas.microsoft.com/office/word/2010/wordprocessingDrawing" xmlns:wp="http://schemas.openxmlformats.org/drawingml/2006/wordprocessingDrawing" xmlns:w10="urn:schemas-microsoft-com:office:word" xmlns:w="http://schemas.openxmlformats.org/wordprocessingml/2006/main" xmlns:w14="http://schemas.microsoft.com/office/word/2010/wordml" xmlns:w15="http://schemas.microsoft.com/office/word/2012/wordml" xmlns:w16cex="http://schemas.microsoft.com/office/word/2018/wordml/cex" xmlns:w16cid="http://schemas.microsoft.com/office/word/2016/wordml/cid" xmlns:w16="http://schemas.microsoft.com/office/word/2018/wordml" xmlns:w16du="http://schemas.microsoft.com/office/word/2023/wordml/word16du" xmlns:w16sdtdh="http://schemas.microsoft.com/office/word/2020/wordml/sdtdatahash" xmlns:w16sdtfl="http://schemas.microsoft.com/office/word/2024/wordml/sdtformatlock" xmlns:w16se="http://schemas.microsoft.com/office/word/2015/wordml/symex" xmlns:wpg="http://schemas.microsoft.com/office/word/2010/wordprocessingGroup" xmlns:wpi="http://schemas.microsoft.com/office/word/2010/wordprocessingInk" xmlns:wne="http://schemas.microsoft.com/office/word/2006/wordml" xmlns:wps="http://schemas.microsoft.com/office/word/2010/wordprocessingShape" mc:Ignorable="w14 w15 w16se w16cid w16 w16cex w16sdtdh w16sdtfl w16du wp14">
   <w:abstractNum w:abstractNumId="0" w15:restartNumberingAfterBreak="0">
+    <w:nsid w:val="02E53093"/>
+    <w:multiLevelType w:val="hybridMultilevel"/>
+    <w:tmpl w:val="69740ECE"/>
+    <w:lvl w:ilvl="0" w:tplc="0409000F">
+      <w:start w:val="1"/>
+      <w:numFmt w:val="decimal"/>
+      <w:lvlText w:val="%1."/>
+      <w:lvlJc w:val="left"/>
+      <w:pPr>
+        <w:ind w:left="720" w:hanging="360"/>
+      </w:pPr>
+    </w:lvl>
+    <w:lvl w:ilvl="1" w:tplc="04090019">
+      <w:start w:val="1"/>
+      <w:numFmt w:val="lowerLetter"/>
+      <w:lvlText w:val="%2."/>
+      <w:lvlJc w:val="left"/>
+      <w:pPr>
+        <w:ind w:left="1440" w:hanging="360"/>
+      </w:pPr>
+    </w:lvl>
+    <w:lvl w:ilvl="2" w:tplc="0409001B" w:tentative="1">
+      <w:start w:val="1"/>
+      <w:numFmt w:val="lowerRoman"/>
+      <w:lvlText w:val="%3."/>
+      <w:lvlJc w:val="right"/>
+      <w:pPr>
+        <w:ind w:left="2160" w:hanging="180"/>
+      </w:pPr>
+    </w:lvl>
+    <w:lvl w:ilvl="3" w:tplc="0409000F" w:tentative="1">
+      <w:start w:val="1"/>
+      <w:numFmt w:val="decimal"/>
+      <w:lvlText w:val="%4."/>
+      <w:lvlJc w:val="left"/>
+      <w:pPr>
+        <w:ind w:left="2880" w:hanging="360"/>
+      </w:pPr>
+    </w:lvl>
+    <w:lvl w:ilvl="4" w:tplc="04090019" w:tentative="1">
+      <w:start w:val="1"/>
+      <w:numFmt w:val="lowerLetter"/>
+      <w:lvlText w:val="%5."/>
+      <w:lvlJc w:val="left"/>
+      <w:pPr>
+        <w:ind w:left="3600" w:hanging="360"/>
+      </w:pPr>
+    </w:lvl>
+    <w:lvl w:ilvl="5" w:tplc="0409001B" w:tentative="1">
+      <w:start w:val="1"/>
+      <w:numFmt w:val="lowerRoman"/>
+      <w:lvlText w:val="%6."/>
+      <w:lvlJc w:val="right"/>
+      <w:pPr>
+        <w:ind w:left="4320" w:hanging="180"/>
+      </w:pPr>
+    </w:lvl>
+    <w:lvl w:ilvl="6" w:tplc="0409000F" w:tentative="1">
+      <w:start w:val="1"/>
+      <w:numFmt w:val="decimal"/>
+      <w:lvlText w:val="%7."/>
+      <w:lvlJc w:val="left"/>
+      <w:pPr>
+        <w:ind w:left="5040" w:hanging="360"/>
+      </w:pPr>
+    </w:lvl>
+    <w:lvl w:ilvl="7" w:tplc="04090019" w:tentative="1">
+      <w:start w:val="1"/>
+      <w:numFmt w:val="lowerLetter"/>
+      <w:lvlText w:val="%8."/>
+      <w:lvlJc w:val="left"/>
+      <w:pPr>
+        <w:ind w:left="5760" w:hanging="360"/>
+      </w:pPr>
+    </w:lvl>
+    <w:lvl w:ilvl="8" w:tplc="0409001B" w:tentative="1">
+      <w:start w:val="1"/>
+      <w:numFmt w:val="lowerRoman"/>
+      <w:lvlText w:val="%9."/>
+      <w:lvlJc w:val="right"/>
+      <w:pPr>
+        <w:ind w:left="6480" w:hanging="180"/>
+      </w:pPr>
+    </w:lvl>
+  </w:abstractNum>
+  <w:abstractNum w:abstractNumId="1" w15:restartNumberingAfterBreak="0">
     <w:nsid w:val="2FFF0E6E"/>
     <w:multiLevelType w:val="hybridMultilevel"/>
     <w:tmpl w:val="7EF85010"/>
@@ -1653,7 +2196,7 @@
       </w:rPr>
     </w:lvl>
   </w:abstractNum>
-  <w:abstractNum w:abstractNumId="1" w15:restartNumberingAfterBreak="0">
+  <w:abstractNum w:abstractNumId="2" w15:restartNumberingAfterBreak="0">
     <w:nsid w:val="30B30DA4"/>
     <w:multiLevelType w:val="multilevel"/>
     <w:tmpl w:val="08AC12CA"/>
@@ -1766,7 +2309,7 @@
       </w:rPr>
     </w:lvl>
   </w:abstractNum>
-  <w:abstractNum w:abstractNumId="2" w15:restartNumberingAfterBreak="0">
+  <w:abstractNum w:abstractNumId="3" w15:restartNumberingAfterBreak="0">
     <w:nsid w:val="38F71E38"/>
     <w:multiLevelType w:val="multilevel"/>
     <w:tmpl w:val="1AC43A52"/>
@@ -1879,7 +2422,346 @@
       </w:rPr>
     </w:lvl>
   </w:abstractNum>
-  <w:abstractNum w:abstractNumId="3" w15:restartNumberingAfterBreak="0">
+  <w:abstractNum w:abstractNumId="4" w15:restartNumberingAfterBreak="0">
+    <w:nsid w:val="3BD51679"/>
+    <w:multiLevelType w:val="hybridMultilevel"/>
+    <w:tmpl w:val="A11C37AA"/>
+    <w:lvl w:ilvl="0" w:tplc="04090001">
+      <w:start w:val="1"/>
+      <w:numFmt w:val="bullet"/>
+      <w:lvlText w:val=""/>
+      <w:lvlJc w:val="left"/>
+      <w:pPr>
+        <w:ind w:left="720" w:hanging="360"/>
+      </w:pPr>
+      <w:rPr>
+        <w:rFonts w:ascii="Symbol" w:hAnsi="Symbol" w:hint="default"/>
+      </w:rPr>
+    </w:lvl>
+    <w:lvl w:ilvl="1" w:tplc="04090003" w:tentative="1">
+      <w:start w:val="1"/>
+      <w:numFmt w:val="bullet"/>
+      <w:lvlText w:val="o"/>
+      <w:lvlJc w:val="left"/>
+      <w:pPr>
+        <w:ind w:left="1440" w:hanging="360"/>
+      </w:pPr>
+      <w:rPr>
+        <w:rFonts w:ascii="Courier New" w:hAnsi="Courier New" w:cs="Courier New" w:hint="default"/>
+      </w:rPr>
+    </w:lvl>
+    <w:lvl w:ilvl="2" w:tplc="04090005" w:tentative="1">
+      <w:start w:val="1"/>
+      <w:numFmt w:val="bullet"/>
+      <w:lvlText w:val=""/>
+      <w:lvlJc w:val="left"/>
+      <w:pPr>
+        <w:ind w:left="2160" w:hanging="360"/>
+      </w:pPr>
+      <w:rPr>
+        <w:rFonts w:ascii="Wingdings" w:hAnsi="Wingdings" w:hint="default"/>
+      </w:rPr>
+    </w:lvl>
+    <w:lvl w:ilvl="3" w:tplc="04090001" w:tentative="1">
+      <w:start w:val="1"/>
+      <w:numFmt w:val="bullet"/>
+      <w:lvlText w:val=""/>
+      <w:lvlJc w:val="left"/>
+      <w:pPr>
+        <w:ind w:left="2880" w:hanging="360"/>
+      </w:pPr>
+      <w:rPr>
+        <w:rFonts w:ascii="Symbol" w:hAnsi="Symbol" w:hint="default"/>
+      </w:rPr>
+    </w:lvl>
+    <w:lvl w:ilvl="4" w:tplc="04090003" w:tentative="1">
+      <w:start w:val="1"/>
+      <w:numFmt w:val="bullet"/>
+      <w:lvlText w:val="o"/>
+      <w:lvlJc w:val="left"/>
+      <w:pPr>
+        <w:ind w:left="3600" w:hanging="360"/>
+      </w:pPr>
+      <w:rPr>
+        <w:rFonts w:ascii="Courier New" w:hAnsi="Courier New" w:cs="Courier New" w:hint="default"/>
+      </w:rPr>
+    </w:lvl>
+    <w:lvl w:ilvl="5" w:tplc="04090005" w:tentative="1">
+      <w:start w:val="1"/>
+      <w:numFmt w:val="bullet"/>
+      <w:lvlText w:val=""/>
+      <w:lvlJc w:val="left"/>
+      <w:pPr>
+        <w:ind w:left="4320" w:hanging="360"/>
+      </w:pPr>
+      <w:rPr>
+        <w:rFonts w:ascii="Wingdings" w:hAnsi="Wingdings" w:hint="default"/>
+      </w:rPr>
+    </w:lvl>
+    <w:lvl w:ilvl="6" w:tplc="04090001" w:tentative="1">
+      <w:start w:val="1"/>
+      <w:numFmt w:val="bullet"/>
+      <w:lvlText w:val=""/>
+      <w:lvlJc w:val="left"/>
+      <w:pPr>
+        <w:ind w:left="5040" w:hanging="360"/>
+      </w:pPr>
+      <w:rPr>
+        <w:rFonts w:ascii="Symbol" w:hAnsi="Symbol" w:hint="default"/>
+      </w:rPr>
+    </w:lvl>
+    <w:lvl w:ilvl="7" w:tplc="04090003" w:tentative="1">
+      <w:start w:val="1"/>
+      <w:numFmt w:val="bullet"/>
+      <w:lvlText w:val="o"/>
+      <w:lvlJc w:val="left"/>
+      <w:pPr>
+        <w:ind w:left="5760" w:hanging="360"/>
+      </w:pPr>
+      <w:rPr>
+        <w:rFonts w:ascii="Courier New" w:hAnsi="Courier New" w:cs="Courier New" w:hint="default"/>
+      </w:rPr>
+    </w:lvl>
+    <w:lvl w:ilvl="8" w:tplc="04090005" w:tentative="1">
+      <w:start w:val="1"/>
+      <w:numFmt w:val="bullet"/>
+      <w:lvlText w:val=""/>
+      <w:lvlJc w:val="left"/>
+      <w:pPr>
+        <w:ind w:left="6480" w:hanging="360"/>
+      </w:pPr>
+      <w:rPr>
+        <w:rFonts w:ascii="Wingdings" w:hAnsi="Wingdings" w:hint="default"/>
+      </w:rPr>
+    </w:lvl>
+  </w:abstractNum>
+  <w:abstractNum w:abstractNumId="5" w15:restartNumberingAfterBreak="0">
+    <w:nsid w:val="4E282A28"/>
+    <w:multiLevelType w:val="hybridMultilevel"/>
+    <w:tmpl w:val="F71A233E"/>
+    <w:lvl w:ilvl="0" w:tplc="04090001">
+      <w:start w:val="1"/>
+      <w:numFmt w:val="bullet"/>
+      <w:lvlText w:val=""/>
+      <w:lvlJc w:val="left"/>
+      <w:pPr>
+        <w:ind w:left="720" w:hanging="360"/>
+      </w:pPr>
+      <w:rPr>
+        <w:rFonts w:ascii="Symbol" w:hAnsi="Symbol" w:hint="default"/>
+      </w:rPr>
+    </w:lvl>
+    <w:lvl w:ilvl="1" w:tplc="04090003" w:tentative="1">
+      <w:start w:val="1"/>
+      <w:numFmt w:val="bullet"/>
+      <w:lvlText w:val="o"/>
+      <w:lvlJc w:val="left"/>
+      <w:pPr>
+        <w:ind w:left="1440" w:hanging="360"/>
+      </w:pPr>
+      <w:rPr>
+        <w:rFonts w:ascii="Courier New" w:hAnsi="Courier New" w:cs="Courier New" w:hint="default"/>
+      </w:rPr>
+    </w:lvl>
+    <w:lvl w:ilvl="2" w:tplc="04090005" w:tentative="1">
+      <w:start w:val="1"/>
+      <w:numFmt w:val="bullet"/>
+      <w:lvlText w:val=""/>
+      <w:lvlJc w:val="left"/>
+      <w:pPr>
+        <w:ind w:left="2160" w:hanging="360"/>
+      </w:pPr>
+      <w:rPr>
+        <w:rFonts w:ascii="Wingdings" w:hAnsi="Wingdings" w:hint="default"/>
+      </w:rPr>
+    </w:lvl>
+    <w:lvl w:ilvl="3" w:tplc="04090001" w:tentative="1">
+      <w:start w:val="1"/>
+      <w:numFmt w:val="bullet"/>
+      <w:lvlText w:val=""/>
+      <w:lvlJc w:val="left"/>
+      <w:pPr>
+        <w:ind w:left="2880" w:hanging="360"/>
+      </w:pPr>
+      <w:rPr>
+        <w:rFonts w:ascii="Symbol" w:hAnsi="Symbol" w:hint="default"/>
+      </w:rPr>
+    </w:lvl>
+    <w:lvl w:ilvl="4" w:tplc="04090003" w:tentative="1">
+      <w:start w:val="1"/>
+      <w:numFmt w:val="bullet"/>
+      <w:lvlText w:val="o"/>
+      <w:lvlJc w:val="left"/>
+      <w:pPr>
+        <w:ind w:left="3600" w:hanging="360"/>
+      </w:pPr>
+      <w:rPr>
+        <w:rFonts w:ascii="Courier New" w:hAnsi="Courier New" w:cs="Courier New" w:hint="default"/>
+      </w:rPr>
+    </w:lvl>
+    <w:lvl w:ilvl="5" w:tplc="04090005" w:tentative="1">
+      <w:start w:val="1"/>
+      <w:numFmt w:val="bullet"/>
+      <w:lvlText w:val=""/>
+      <w:lvlJc w:val="left"/>
+      <w:pPr>
+        <w:ind w:left="4320" w:hanging="360"/>
+      </w:pPr>
+      <w:rPr>
+        <w:rFonts w:ascii="Wingdings" w:hAnsi="Wingdings" w:hint="default"/>
+      </w:rPr>
+    </w:lvl>
+    <w:lvl w:ilvl="6" w:tplc="04090001" w:tentative="1">
+      <w:start w:val="1"/>
+      <w:numFmt w:val="bullet"/>
+      <w:lvlText w:val=""/>
+      <w:lvlJc w:val="left"/>
+      <w:pPr>
+        <w:ind w:left="5040" w:hanging="360"/>
+      </w:pPr>
+      <w:rPr>
+        <w:rFonts w:ascii="Symbol" w:hAnsi="Symbol" w:hint="default"/>
+      </w:rPr>
+    </w:lvl>
+    <w:lvl w:ilvl="7" w:tplc="04090003" w:tentative="1">
+      <w:start w:val="1"/>
+      <w:numFmt w:val="bullet"/>
+      <w:lvlText w:val="o"/>
+      <w:lvlJc w:val="left"/>
+      <w:pPr>
+        <w:ind w:left="5760" w:hanging="360"/>
+      </w:pPr>
+      <w:rPr>
+        <w:rFonts w:ascii="Courier New" w:hAnsi="Courier New" w:cs="Courier New" w:hint="default"/>
+      </w:rPr>
+    </w:lvl>
+    <w:lvl w:ilvl="8" w:tplc="04090005" w:tentative="1">
+      <w:start w:val="1"/>
+      <w:numFmt w:val="bullet"/>
+      <w:lvlText w:val=""/>
+      <w:lvlJc w:val="left"/>
+      <w:pPr>
+        <w:ind w:left="6480" w:hanging="360"/>
+      </w:pPr>
+      <w:rPr>
+        <w:rFonts w:ascii="Wingdings" w:hAnsi="Wingdings" w:hint="default"/>
+      </w:rPr>
+    </w:lvl>
+  </w:abstractNum>
+  <w:abstractNum w:abstractNumId="6" w15:restartNumberingAfterBreak="0">
+    <w:nsid w:val="564F625A"/>
+    <w:multiLevelType w:val="hybridMultilevel"/>
+    <w:tmpl w:val="D32259CC"/>
+    <w:lvl w:ilvl="0" w:tplc="04090001">
+      <w:start w:val="1"/>
+      <w:numFmt w:val="bullet"/>
+      <w:lvlText w:val=""/>
+      <w:lvlJc w:val="left"/>
+      <w:pPr>
+        <w:ind w:left="720" w:hanging="360"/>
+      </w:pPr>
+      <w:rPr>
+        <w:rFonts w:ascii="Symbol" w:hAnsi="Symbol" w:hint="default"/>
+      </w:rPr>
+    </w:lvl>
+    <w:lvl w:ilvl="1" w:tplc="04090003" w:tentative="1">
+      <w:start w:val="1"/>
+      <w:numFmt w:val="bullet"/>
+      <w:lvlText w:val="o"/>
+      <w:lvlJc w:val="left"/>
+      <w:pPr>
+        <w:ind w:left="1440" w:hanging="360"/>
+      </w:pPr>
+      <w:rPr>
+        <w:rFonts w:ascii="Courier New" w:hAnsi="Courier New" w:cs="Courier New" w:hint="default"/>
+      </w:rPr>
+    </w:lvl>
+    <w:lvl w:ilvl="2" w:tplc="04090005" w:tentative="1">
+      <w:start w:val="1"/>
+      <w:numFmt w:val="bullet"/>
+      <w:lvlText w:val=""/>
+      <w:lvlJc w:val="left"/>
+      <w:pPr>
+        <w:ind w:left="2160" w:hanging="360"/>
+      </w:pPr>
+      <w:rPr>
+        <w:rFonts w:ascii="Wingdings" w:hAnsi="Wingdings" w:hint="default"/>
+      </w:rPr>
+    </w:lvl>
+    <w:lvl w:ilvl="3" w:tplc="04090001" w:tentative="1">
+      <w:start w:val="1"/>
+      <w:numFmt w:val="bullet"/>
+      <w:lvlText w:val=""/>
+      <w:lvlJc w:val="left"/>
+      <w:pPr>
+        <w:ind w:left="2880" w:hanging="360"/>
+      </w:pPr>
+      <w:rPr>
+        <w:rFonts w:ascii="Symbol" w:hAnsi="Symbol" w:hint="default"/>
+      </w:rPr>
+    </w:lvl>
+    <w:lvl w:ilvl="4" w:tplc="04090003" w:tentative="1">
+      <w:start w:val="1"/>
+      <w:numFmt w:val="bullet"/>
+      <w:lvlText w:val="o"/>
+      <w:lvlJc w:val="left"/>
+      <w:pPr>
+        <w:ind w:left="3600" w:hanging="360"/>
+      </w:pPr>
+      <w:rPr>
+        <w:rFonts w:ascii="Courier New" w:hAnsi="Courier New" w:cs="Courier New" w:hint="default"/>
+      </w:rPr>
+    </w:lvl>
+    <w:lvl w:ilvl="5" w:tplc="04090005" w:tentative="1">
+      <w:start w:val="1"/>
+      <w:numFmt w:val="bullet"/>
+      <w:lvlText w:val=""/>
+      <w:lvlJc w:val="left"/>
+      <w:pPr>
+        <w:ind w:left="4320" w:hanging="360"/>
+      </w:pPr>
+      <w:rPr>
+        <w:rFonts w:ascii="Wingdings" w:hAnsi="Wingdings" w:hint="default"/>
+      </w:rPr>
+    </w:lvl>
+    <w:lvl w:ilvl="6" w:tplc="04090001" w:tentative="1">
+      <w:start w:val="1"/>
+      <w:numFmt w:val="bullet"/>
+      <w:lvlText w:val=""/>
+      <w:lvlJc w:val="left"/>
+      <w:pPr>
+        <w:ind w:left="5040" w:hanging="360"/>
+      </w:pPr>
+      <w:rPr>
+        <w:rFonts w:ascii="Symbol" w:hAnsi="Symbol" w:hint="default"/>
+      </w:rPr>
+    </w:lvl>
+    <w:lvl w:ilvl="7" w:tplc="04090003" w:tentative="1">
+      <w:start w:val="1"/>
+      <w:numFmt w:val="bullet"/>
+      <w:lvlText w:val="o"/>
+      <w:lvlJc w:val="left"/>
+      <w:pPr>
+        <w:ind w:left="5760" w:hanging="360"/>
+      </w:pPr>
+      <w:rPr>
+        <w:rFonts w:ascii="Courier New" w:hAnsi="Courier New" w:cs="Courier New" w:hint="default"/>
+      </w:rPr>
+    </w:lvl>
+    <w:lvl w:ilvl="8" w:tplc="04090005" w:tentative="1">
+      <w:start w:val="1"/>
+      <w:numFmt w:val="bullet"/>
+      <w:lvlText w:val=""/>
+      <w:lvlJc w:val="left"/>
+      <w:pPr>
+        <w:ind w:left="6480" w:hanging="360"/>
+      </w:pPr>
+      <w:rPr>
+        <w:rFonts w:ascii="Wingdings" w:hAnsi="Wingdings" w:hint="default"/>
+      </w:rPr>
+    </w:lvl>
+  </w:abstractNum>
+  <w:abstractNum w:abstractNumId="7" w15:restartNumberingAfterBreak="0">
     <w:nsid w:val="63BA31E8"/>
     <w:multiLevelType w:val="hybridMultilevel"/>
     <w:tmpl w:val="7BEEE510"/>
@@ -1992,7 +2874,7 @@
       </w:rPr>
     </w:lvl>
   </w:abstractNum>
-  <w:abstractNum w:abstractNumId="4" w15:restartNumberingAfterBreak="0">
+  <w:abstractNum w:abstractNumId="8" w15:restartNumberingAfterBreak="0">
     <w:nsid w:val="65E0033E"/>
     <w:multiLevelType w:val="hybridMultilevel"/>
     <w:tmpl w:val="198A47C0"/>
@@ -2105,7 +2987,7 @@
       </w:rPr>
     </w:lvl>
   </w:abstractNum>
-  <w:abstractNum w:abstractNumId="5" w15:restartNumberingAfterBreak="0">
+  <w:abstractNum w:abstractNumId="9" w15:restartNumberingAfterBreak="0">
     <w:nsid w:val="66BC006B"/>
     <w:multiLevelType w:val="multilevel"/>
     <w:tmpl w:val="89D2BAAC"/>
@@ -2218,7 +3100,7 @@
       </w:rPr>
     </w:lvl>
   </w:abstractNum>
-  <w:abstractNum w:abstractNumId="6" w15:restartNumberingAfterBreak="0">
+  <w:abstractNum w:abstractNumId="10" w15:restartNumberingAfterBreak="0">
     <w:nsid w:val="79CE186E"/>
     <w:multiLevelType w:val="hybridMultilevel"/>
     <w:tmpl w:val="1A5215AE"/>
@@ -2331,26 +3213,154 @@
       </w:rPr>
     </w:lvl>
   </w:abstractNum>
+  <w:abstractNum w:abstractNumId="11" w15:restartNumberingAfterBreak="0">
+    <w:nsid w:val="7DD06E6D"/>
+    <w:multiLevelType w:val="hybridMultilevel"/>
+    <w:tmpl w:val="45426744"/>
+    <w:lvl w:ilvl="0" w:tplc="04090001">
+      <w:start w:val="1"/>
+      <w:numFmt w:val="bullet"/>
+      <w:lvlText w:val=""/>
+      <w:lvlJc w:val="left"/>
+      <w:pPr>
+        <w:ind w:left="720" w:hanging="360"/>
+      </w:pPr>
+      <w:rPr>
+        <w:rFonts w:ascii="Symbol" w:hAnsi="Symbol" w:hint="default"/>
+      </w:rPr>
+    </w:lvl>
+    <w:lvl w:ilvl="1" w:tplc="04090003">
+      <w:start w:val="1"/>
+      <w:numFmt w:val="bullet"/>
+      <w:lvlText w:val="o"/>
+      <w:lvlJc w:val="left"/>
+      <w:pPr>
+        <w:ind w:left="1440" w:hanging="360"/>
+      </w:pPr>
+      <w:rPr>
+        <w:rFonts w:ascii="Courier New" w:hAnsi="Courier New" w:cs="Courier New" w:hint="default"/>
+      </w:rPr>
+    </w:lvl>
+    <w:lvl w:ilvl="2" w:tplc="04090005" w:tentative="1">
+      <w:start w:val="1"/>
+      <w:numFmt w:val="bullet"/>
+      <w:lvlText w:val=""/>
+      <w:lvlJc w:val="left"/>
+      <w:pPr>
+        <w:ind w:left="2160" w:hanging="360"/>
+      </w:pPr>
+      <w:rPr>
+        <w:rFonts w:ascii="Wingdings" w:hAnsi="Wingdings" w:hint="default"/>
+      </w:rPr>
+    </w:lvl>
+    <w:lvl w:ilvl="3" w:tplc="04090001" w:tentative="1">
+      <w:start w:val="1"/>
+      <w:numFmt w:val="bullet"/>
+      <w:lvlText w:val=""/>
+      <w:lvlJc w:val="left"/>
+      <w:pPr>
+        <w:ind w:left="2880" w:hanging="360"/>
+      </w:pPr>
+      <w:rPr>
+        <w:rFonts w:ascii="Symbol" w:hAnsi="Symbol" w:hint="default"/>
+      </w:rPr>
+    </w:lvl>
+    <w:lvl w:ilvl="4" w:tplc="04090003" w:tentative="1">
+      <w:start w:val="1"/>
+      <w:numFmt w:val="bullet"/>
+      <w:lvlText w:val="o"/>
+      <w:lvlJc w:val="left"/>
+      <w:pPr>
+        <w:ind w:left="3600" w:hanging="360"/>
+      </w:pPr>
+      <w:rPr>
+        <w:rFonts w:ascii="Courier New" w:hAnsi="Courier New" w:cs="Courier New" w:hint="default"/>
+      </w:rPr>
+    </w:lvl>
+    <w:lvl w:ilvl="5" w:tplc="04090005" w:tentative="1">
+      <w:start w:val="1"/>
+      <w:numFmt w:val="bullet"/>
+      <w:lvlText w:val=""/>
+      <w:lvlJc w:val="left"/>
+      <w:pPr>
+        <w:ind w:left="4320" w:hanging="360"/>
+      </w:pPr>
+      <w:rPr>
+        <w:rFonts w:ascii="Wingdings" w:hAnsi="Wingdings" w:hint="default"/>
+      </w:rPr>
+    </w:lvl>
+    <w:lvl w:ilvl="6" w:tplc="04090001" w:tentative="1">
+      <w:start w:val="1"/>
+      <w:numFmt w:val="bullet"/>
+      <w:lvlText w:val=""/>
+      <w:lvlJc w:val="left"/>
+      <w:pPr>
+        <w:ind w:left="5040" w:hanging="360"/>
+      </w:pPr>
+      <w:rPr>
+        <w:rFonts w:ascii="Symbol" w:hAnsi="Symbol" w:hint="default"/>
+      </w:rPr>
+    </w:lvl>
+    <w:lvl w:ilvl="7" w:tplc="04090003" w:tentative="1">
+      <w:start w:val="1"/>
+      <w:numFmt w:val="bullet"/>
+      <w:lvlText w:val="o"/>
+      <w:lvlJc w:val="left"/>
+      <w:pPr>
+        <w:ind w:left="5760" w:hanging="360"/>
+      </w:pPr>
+      <w:rPr>
+        <w:rFonts w:ascii="Courier New" w:hAnsi="Courier New" w:cs="Courier New" w:hint="default"/>
+      </w:rPr>
+    </w:lvl>
+    <w:lvl w:ilvl="8" w:tplc="04090005" w:tentative="1">
+      <w:start w:val="1"/>
+      <w:numFmt w:val="bullet"/>
+      <w:lvlText w:val=""/>
+      <w:lvlJc w:val="left"/>
+      <w:pPr>
+        <w:ind w:left="6480" w:hanging="360"/>
+      </w:pPr>
+      <w:rPr>
+        <w:rFonts w:ascii="Wingdings" w:hAnsi="Wingdings" w:hint="default"/>
+      </w:rPr>
+    </w:lvl>
+  </w:abstractNum>
   <w:num w:numId="1" w16cid:durableId="1421218679">
-    <w:abstractNumId w:val="5"/>
+    <w:abstractNumId w:val="9"/>
   </w:num>
   <w:num w:numId="2" w16cid:durableId="1665742490">
+    <w:abstractNumId w:val="8"/>
+  </w:num>
+  <w:num w:numId="3" w16cid:durableId="820318511">
+    <w:abstractNumId w:val="10"/>
+  </w:num>
+  <w:num w:numId="4" w16cid:durableId="491289210">
+    <w:abstractNumId w:val="7"/>
+  </w:num>
+  <w:num w:numId="5" w16cid:durableId="1594584825">
+    <w:abstractNumId w:val="3"/>
+  </w:num>
+  <w:num w:numId="6" w16cid:durableId="598753073">
+    <w:abstractNumId w:val="2"/>
+  </w:num>
+  <w:num w:numId="7" w16cid:durableId="271980993">
+    <w:abstractNumId w:val="1"/>
+  </w:num>
+  <w:num w:numId="8" w16cid:durableId="1306472047">
+    <w:abstractNumId w:val="0"/>
+  </w:num>
+  <w:num w:numId="9" w16cid:durableId="476655815">
+    <w:abstractNumId w:val="11"/>
+  </w:num>
+  <w:num w:numId="10" w16cid:durableId="1433863939">
     <w:abstractNumId w:val="4"/>
   </w:num>
-  <w:num w:numId="3" w16cid:durableId="820318511">
+  <w:num w:numId="11" w16cid:durableId="1630621566">
     <w:abstractNumId w:val="6"/>
   </w:num>
-  <w:num w:numId="4" w16cid:durableId="491289210">
-    <w:abstractNumId w:val="3"/>
-  </w:num>
-  <w:num w:numId="5" w16cid:durableId="1594584825">
-    <w:abstractNumId w:val="2"/>
-  </w:num>
-  <w:num w:numId="6" w16cid:durableId="598753073">
-    <w:abstractNumId w:val="1"/>
-  </w:num>
-  <w:num w:numId="7" w16cid:durableId="271980993">
-    <w:abstractNumId w:val="0"/>
+  <w:num w:numId="12" w16cid:durableId="1949699321">
+    <w:abstractNumId w:val="5"/>
   </w:num>
 </w:numbering>
 </file>
@@ -2871,6 +3881,7 @@
   <w:style w:type="character" w:default="1" w:styleId="DefaultParagraphFont">
     <w:name w:val="Default Paragraph Font"/>
     <w:uiPriority w:val="1"/>
+    <w:semiHidden/>
     <w:unhideWhenUsed/>
   </w:style>
   <w:style w:type="table" w:default="1" w:styleId="TableNormal">

</xml_diff>